<commit_message>
new file:   .nicegui/storage-user-347e3b74-1254-44f1-88d5-4ecd2698784c.json 	modified:   logs/activity_log.txt 	modified:   logs/system_log.txt 	modified:   templets/year - Temp - Ar - D - SBS.docx 	new file:   templets/~$ar - Temp - Ar - D - SBS.docx 	new file:   templets/~$mester - Temp - Ar - D - SBS.docx 	new file:   templets/~WRL3950.tmp
</commit_message>
<xml_diff>
--- a/templets/year - Temp - Ar - D - SBS.docx
+++ b/templets/year - Temp - Ar - D - SBS.docx
@@ -29,13 +29,13 @@
         <mc:AlternateContent>
           <mc:Choice Requires="wps">
             <w:drawing>
-              <wp:anchor distT="0" distB="0" distL="114300" distR="114300" simplePos="0" relativeHeight="251659264" behindDoc="0" locked="0" layoutInCell="1" allowOverlap="1" wp14:anchorId="6AB004C9" wp14:editId="33DB7651">
+              <wp:anchor distT="0" distB="0" distL="114300" distR="114300" simplePos="0" relativeHeight="251659264" behindDoc="0" locked="0" layoutInCell="1" allowOverlap="1" wp14:anchorId="5F0150BB" wp14:editId="5082F9BD">
                 <wp:simplePos x="0" y="0"/>
                 <wp:positionH relativeFrom="column">
-                  <wp:posOffset>5228392</wp:posOffset>
+                  <wp:posOffset>665480</wp:posOffset>
                 </wp:positionH>
                 <wp:positionV relativeFrom="paragraph">
-                  <wp:posOffset>-850867</wp:posOffset>
+                  <wp:posOffset>-812165</wp:posOffset>
                 </wp:positionV>
                 <wp:extent cx="1076325" cy="1228725"/>
                 <wp:effectExtent l="0" t="0" r="28575" b="28575"/>
@@ -91,9 +91,9 @@
               </wp:anchor>
             </w:drawing>
           </mc:Choice>
-          <mc:Fallback xmlns:w16cei="http://schemas.microsoft.com/office/word/2026/wordml/cei">
+          <mc:Fallback>
             <w:pict>
-              <v:rect w14:anchorId="074BCC88" id="Rectangle 1" o:spid="_x0000_s1026" style="position:absolute;margin-left:411.7pt;margin-top:-67pt;width:84.75pt;height:96.75pt;z-index:251659264;visibility:visible;mso-wrap-style:square;mso-wrap-distance-left:9pt;mso-wrap-distance-top:0;mso-wrap-distance-right:9pt;mso-wrap-distance-bottom:0;mso-position-horizontal:absolute;mso-position-horizontal-relative:text;mso-position-vertical:absolute;mso-position-vertical-relative:text;v-text-anchor:middle" o:gfxdata="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" filled="f" strokecolor="black [3200]">
+              <v:rect w14:anchorId="37D15114" id="Rectangle 1" o:spid="_x0000_s1026" style="position:absolute;margin-left:52.4pt;margin-top:-63.95pt;width:84.75pt;height:96.75pt;z-index:251659264;visibility:visible;mso-wrap-style:square;mso-wrap-distance-left:9pt;mso-wrap-distance-top:0;mso-wrap-distance-right:9pt;mso-wrap-distance-bottom:0;mso-position-horizontal:absolute;mso-position-horizontal-relative:text;mso-position-vertical:absolute;mso-position-vertical-relative:text;v-text-anchor:middle" o:gfxdata="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" filled="f" strokecolor="black [3200]">
                 <v:stroke joinstyle="round"/>
               </v:rect>
             </w:pict>
@@ -155,6 +155,7 @@
           <w:bCs/>
           <w:sz w:val="24"/>
           <w:szCs w:val="24"/>
+          <w:u w:val="single"/>
           <w:rtl/>
           <w:lang w:bidi="ar-IQ"/>
         </w:rPr>
@@ -167,6 +168,7 @@
           <w:bCs/>
           <w:sz w:val="24"/>
           <w:szCs w:val="24"/>
+          <w:u w:val="single"/>
           <w:lang w:bidi="ar-IQ"/>
         </w:rPr>
         <w:t>Title</w:t>
@@ -178,6 +180,7 @@
           <w:bCs/>
           <w:sz w:val="24"/>
           <w:szCs w:val="24"/>
+          <w:u w:val="single"/>
           <w:rtl/>
           <w:lang w:bidi="ar-IQ"/>
         </w:rPr>
@@ -188,7 +191,7 @@
       <w:tblPr>
         <w:tblStyle w:val="TableGrid"/>
         <w:bidiVisual/>
-        <w:tblW w:w="0" w:type="auto"/>
+        <w:tblW w:w="10466" w:type="dxa"/>
         <w:tblBorders>
           <w:top w:val="none" w:sz="0" w:space="0" w:color="auto"/>
           <w:left w:val="none" w:sz="0" w:space="0" w:color="auto"/>
@@ -201,21 +204,21 @@
         <w:tblLook w:val="04A0" w:firstRow="1" w:lastRow="0" w:firstColumn="1" w:lastColumn="0" w:noHBand="0" w:noVBand="1"/>
       </w:tblPr>
       <w:tblGrid>
-        <w:gridCol w:w="3240"/>
-        <w:gridCol w:w="2997"/>
-        <w:gridCol w:w="2369"/>
+        <w:gridCol w:w="4265"/>
+        <w:gridCol w:w="1890"/>
+        <w:gridCol w:w="2451"/>
         <w:gridCol w:w="1860"/>
       </w:tblGrid>
       <w:tr>
         <w:tc>
           <w:tcPr>
-            <w:tcW w:w="6237" w:type="dxa"/>
+            <w:tcW w:w="6155" w:type="dxa"/>
             <w:gridSpan w:val="2"/>
           </w:tcPr>
           <w:p>
             <w:pPr>
               <w:keepNext/>
-              <w:spacing w:after="0" w:line="240" w:lineRule="auto"/>
+              <w:spacing w:line="240" w:lineRule="auto"/>
               <w:rPr>
                 <w:rFonts w:asciiTheme="minorBidi" w:hAnsiTheme="minorBidi" w:cstheme="minorBidi"/>
                 <w:sz w:val="24"/>
@@ -242,7 +245,6 @@
               </w:rPr>
               <w:t>{{</w:t>
             </w:r>
-            <w:proofErr w:type="spellStart"/>
             <w:r>
               <w:rPr>
                 <w:rFonts w:asciiTheme="minorBidi" w:hAnsiTheme="minorBidi" w:cstheme="minorBidi"/>
@@ -252,7 +254,6 @@
               </w:rPr>
               <w:t>student_name</w:t>
             </w:r>
-            <w:proofErr w:type="spellEnd"/>
             <w:r>
               <w:rPr>
                 <w:rFonts w:asciiTheme="minorBidi" w:hAnsiTheme="minorBidi" w:cstheme="minorBidi"/>
@@ -267,12 +268,12 @@
         </w:tc>
         <w:tc>
           <w:tcPr>
-            <w:tcW w:w="2369" w:type="dxa"/>
+            <w:tcW w:w="2451" w:type="dxa"/>
           </w:tcPr>
           <w:p>
             <w:pPr>
               <w:keepNext/>
-              <w:spacing w:after="0" w:line="240" w:lineRule="auto"/>
+              <w:spacing w:line="240" w:lineRule="auto"/>
               <w:rPr>
                 <w:rFonts w:asciiTheme="minorBidi" w:hAnsiTheme="minorBidi" w:cstheme="minorBidi"/>
                 <w:sz w:val="24"/>
@@ -289,7 +290,7 @@
           <w:p>
             <w:pPr>
               <w:keepNext/>
-              <w:spacing w:after="0" w:line="240" w:lineRule="auto"/>
+              <w:spacing w:line="240" w:lineRule="auto"/>
               <w:rPr>
                 <w:rFonts w:asciiTheme="minorBidi" w:hAnsiTheme="minorBidi" w:cstheme="minorBidi"/>
                 <w:sz w:val="24"/>
@@ -303,13 +304,13 @@
       <w:tr>
         <w:tc>
           <w:tcPr>
-            <w:tcW w:w="6237" w:type="dxa"/>
+            <w:tcW w:w="6155" w:type="dxa"/>
             <w:gridSpan w:val="2"/>
           </w:tcPr>
           <w:p>
             <w:pPr>
               <w:keepNext/>
-              <w:spacing w:after="0" w:line="240" w:lineRule="auto"/>
+              <w:spacing w:line="240" w:lineRule="auto"/>
               <w:rPr>
                 <w:rFonts w:asciiTheme="minorBidi" w:hAnsiTheme="minorBidi" w:cstheme="minorBidi"/>
                 <w:sz w:val="24"/>
@@ -339,13 +340,13 @@
         </w:tc>
         <w:tc>
           <w:tcPr>
-            <w:tcW w:w="4229" w:type="dxa"/>
+            <w:tcW w:w="4311" w:type="dxa"/>
             <w:gridSpan w:val="2"/>
           </w:tcPr>
           <w:p>
             <w:pPr>
               <w:keepNext/>
-              <w:spacing w:after="0" w:line="240" w:lineRule="auto"/>
+              <w:spacing w:line="240" w:lineRule="auto"/>
               <w:rPr>
                 <w:rFonts w:asciiTheme="minorBidi" w:hAnsiTheme="minorBidi" w:cstheme="minorBidi"/>
                 <w:sz w:val="24"/>
@@ -355,12 +356,21 @@
             </w:pPr>
             <w:r>
               <w:rPr>
+                <w:rFonts w:asciiTheme="minorBidi" w:hAnsiTheme="minorBidi" w:cstheme="minorBidi" w:hint="cs"/>
+                <w:sz w:val="24"/>
+                <w:szCs w:val="24"/>
+                <w:rtl/>
+              </w:rPr>
+              <w:t>الجنسية</w:t>
+            </w:r>
+            <w:r>
+              <w:rPr>
                 <w:rFonts w:asciiTheme="minorBidi" w:hAnsiTheme="minorBidi" w:cstheme="minorBidi"/>
                 <w:sz w:val="24"/>
                 <w:szCs w:val="24"/>
                 <w:rtl/>
               </w:rPr>
-              <w:t xml:space="preserve">الهوية: </w:t>
+              <w:t xml:space="preserve">: </w:t>
             </w:r>
             <w:r>
               <w:rPr>
@@ -397,12 +407,127 @@
       <w:tr>
         <w:tc>
           <w:tcPr>
-            <w:tcW w:w="3240" w:type="dxa"/>
+            <w:tcW w:w="6155" w:type="dxa"/>
+            <w:gridSpan w:val="2"/>
           </w:tcPr>
           <w:p>
             <w:pPr>
               <w:keepNext/>
-              <w:spacing w:after="0" w:line="240" w:lineRule="auto"/>
+              <w:spacing w:line="240" w:lineRule="auto"/>
+              <w:rPr>
+                <w:rFonts w:asciiTheme="minorBidi" w:hAnsiTheme="minorBidi" w:cstheme="minorBidi"/>
+                <w:sz w:val="24"/>
+                <w:szCs w:val="24"/>
+                <w:lang w:bidi="ar-IQ"/>
+              </w:rPr>
+            </w:pPr>
+            <w:r>
+              <w:rPr>
+                <w:rFonts w:asciiTheme="minorBidi" w:hAnsiTheme="minorBidi" w:cstheme="minorBidi"/>
+                <w:sz w:val="24"/>
+                <w:szCs w:val="24"/>
+                <w:rtl/>
+              </w:rPr>
+              <w:t xml:space="preserve">سنة القبول: </w:t>
+            </w:r>
+            <w:r>
+              <w:rPr>
+                <w:rFonts w:asciiTheme="minorBidi" w:hAnsiTheme="minorBidi" w:cstheme="minorBidi"/>
+                <w:sz w:val="24"/>
+                <w:szCs w:val="24"/>
+                <w:rtl/>
+                <w:lang w:bidi="ar-IQ"/>
+              </w:rPr>
+              <w:t>{{</w:t>
+            </w:r>
+            <w:r>
+              <w:rPr>
+                <w:rFonts w:asciiTheme="minorBidi" w:hAnsiTheme="minorBidi" w:cstheme="minorBidi"/>
+                <w:sz w:val="24"/>
+                <w:szCs w:val="24"/>
+                <w:lang w:bidi="ar-IQ"/>
+              </w:rPr>
+              <w:t>admission_year</w:t>
+            </w:r>
+            <w:r>
+              <w:rPr>
+                <w:rFonts w:asciiTheme="minorBidi" w:hAnsiTheme="minorBidi" w:cstheme="minorBidi"/>
+                <w:sz w:val="24"/>
+                <w:szCs w:val="24"/>
+                <w:rtl/>
+                <w:lang w:bidi="ar-IQ"/>
+              </w:rPr>
+              <w:t>}}</w:t>
+            </w:r>
+          </w:p>
+        </w:tc>
+        <w:tc>
+          <w:tcPr>
+            <w:tcW w:w="4311" w:type="dxa"/>
+            <w:gridSpan w:val="2"/>
+          </w:tcPr>
+          <w:p>
+            <w:pPr>
+              <w:keepNext/>
+              <w:spacing w:line="240" w:lineRule="auto"/>
+              <w:rPr>
+                <w:rFonts w:asciiTheme="minorBidi" w:hAnsiTheme="minorBidi" w:cstheme="minorBidi"/>
+                <w:sz w:val="24"/>
+                <w:szCs w:val="24"/>
+                <w:lang w:bidi="ar-IQ"/>
+              </w:rPr>
+            </w:pPr>
+            <w:r>
+              <w:rPr>
+                <w:rFonts w:asciiTheme="minorBidi" w:hAnsiTheme="minorBidi" w:cstheme="minorBidi"/>
+                <w:sz w:val="24"/>
+                <w:szCs w:val="24"/>
+                <w:rtl/>
+              </w:rPr>
+              <w:t xml:space="preserve">القسم: </w:t>
+            </w:r>
+            <w:r>
+              <w:rPr>
+                <w:rFonts w:asciiTheme="minorBidi" w:hAnsiTheme="minorBidi" w:cstheme="minorBidi"/>
+                <w:sz w:val="24"/>
+                <w:szCs w:val="24"/>
+                <w:rtl/>
+                <w:lang w:bidi="ar-IQ"/>
+              </w:rPr>
+              <w:t>{{</w:t>
+            </w:r>
+            <w:r>
+              <w:rPr>
+                <w:rFonts w:asciiTheme="minorBidi" w:hAnsiTheme="minorBidi" w:cstheme="minorBidi"/>
+                <w:sz w:val="24"/>
+                <w:szCs w:val="24"/>
+                <w:lang w:bidi="ar-IQ"/>
+              </w:rPr>
+              <w:t>department_id</w:t>
+            </w:r>
+            <w:r>
+              <w:rPr>
+                <w:rFonts w:asciiTheme="minorBidi" w:hAnsiTheme="minorBidi" w:cstheme="minorBidi"/>
+                <w:sz w:val="24"/>
+                <w:szCs w:val="24"/>
+                <w:rtl/>
+                <w:lang w:bidi="ar-IQ"/>
+              </w:rPr>
+              <w:t>}}</w:t>
+            </w:r>
+          </w:p>
+        </w:tc>
+      </w:tr>
+      <w:tr>
+        <w:tc>
+          <w:tcPr>
+            <w:tcW w:w="6155" w:type="dxa"/>
+            <w:gridSpan w:val="2"/>
+          </w:tcPr>
+          <w:p>
+            <w:pPr>
+              <w:keepNext/>
+              <w:spacing w:line="240" w:lineRule="auto"/>
               <w:rPr>
                 <w:rFonts w:asciiTheme="minorBidi" w:hAnsiTheme="minorBidi" w:cstheme="minorBidi"/>
                 <w:b/>
@@ -414,55 +539,33 @@
             </w:pPr>
             <w:r>
               <w:rPr>
+                <w:rFonts w:asciiTheme="minorBidi" w:hAnsiTheme="minorBidi" w:cstheme="minorBidi" w:hint="cs"/>
+                <w:sz w:val="24"/>
+                <w:szCs w:val="24"/>
+                <w:rtl/>
+              </w:rPr>
+              <w:t>الشهادة</w:t>
+            </w:r>
+            <w:r>
+              <w:rPr>
                 <w:rFonts w:asciiTheme="minorBidi" w:hAnsiTheme="minorBidi" w:cstheme="minorBidi"/>
                 <w:sz w:val="24"/>
                 <w:szCs w:val="24"/>
                 <w:rtl/>
               </w:rPr>
-              <w:t xml:space="preserve">سنة القبول: </w:t>
-            </w:r>
-            <w:r>
-              <w:rPr>
-                <w:rFonts w:asciiTheme="minorBidi" w:hAnsiTheme="minorBidi" w:cstheme="minorBidi"/>
-                <w:sz w:val="24"/>
-                <w:szCs w:val="24"/>
-                <w:rtl/>
-                <w:lang w:bidi="ar-IQ"/>
-              </w:rPr>
-              <w:t>{{</w:t>
-            </w:r>
-            <w:proofErr w:type="spellStart"/>
-            <w:r>
-              <w:rPr>
-                <w:rFonts w:asciiTheme="minorBidi" w:hAnsiTheme="minorBidi" w:cstheme="minorBidi"/>
-                <w:sz w:val="24"/>
-                <w:szCs w:val="24"/>
-                <w:lang w:bidi="ar-IQ"/>
-              </w:rPr>
-              <w:t>admission_year</w:t>
-            </w:r>
-            <w:proofErr w:type="spellEnd"/>
-            <w:r>
-              <w:rPr>
-                <w:rFonts w:asciiTheme="minorBidi" w:hAnsiTheme="minorBidi" w:cstheme="minorBidi"/>
-                <w:sz w:val="24"/>
-                <w:szCs w:val="24"/>
-                <w:rtl/>
-                <w:lang w:bidi="ar-IQ"/>
-              </w:rPr>
-              <w:t>}}</w:t>
+              <w:t>: البكلوريوس في العلوم وتكنولوجيا المعلومات</w:t>
             </w:r>
           </w:p>
         </w:tc>
         <w:tc>
           <w:tcPr>
-            <w:tcW w:w="5366" w:type="dxa"/>
+            <w:tcW w:w="4311" w:type="dxa"/>
             <w:gridSpan w:val="2"/>
           </w:tcPr>
           <w:p>
             <w:pPr>
               <w:keepNext/>
-              <w:spacing w:after="0" w:line="240" w:lineRule="auto"/>
+              <w:spacing w:line="240" w:lineRule="auto"/>
               <w:rPr>
                 <w:rFonts w:asciiTheme="minorBidi" w:hAnsiTheme="minorBidi" w:cstheme="minorBidi"/>
                 <w:sz w:val="24"/>
@@ -477,7 +580,7 @@
                 <w:szCs w:val="24"/>
                 <w:rtl/>
               </w:rPr>
-              <w:t xml:space="preserve">القسم: </w:t>
+              <w:t xml:space="preserve">الدراسة: </w:t>
             </w:r>
             <w:r>
               <w:rPr>
@@ -487,9 +590,8 @@
                 <w:rtl/>
                 <w:lang w:bidi="ar-IQ"/>
               </w:rPr>
-              <w:t>{{</w:t>
-            </w:r>
-            <w:proofErr w:type="spellStart"/>
+              <w:t xml:space="preserve"> {{</w:t>
+            </w:r>
             <w:r>
               <w:rPr>
                 <w:rFonts w:asciiTheme="minorBidi" w:hAnsiTheme="minorBidi" w:cstheme="minorBidi"/>
@@ -497,9 +599,190 @@
                 <w:szCs w:val="24"/>
                 <w:lang w:bidi="ar-IQ"/>
               </w:rPr>
-              <w:t>department_id</w:t>
-            </w:r>
-            <w:proofErr w:type="spellEnd"/>
+              <w:t>study_type</w:t>
+            </w:r>
+            <w:r>
+              <w:rPr>
+                <w:rFonts w:asciiTheme="minorBidi" w:hAnsiTheme="minorBidi" w:cstheme="minorBidi"/>
+                <w:sz w:val="24"/>
+                <w:szCs w:val="24"/>
+                <w:rtl/>
+                <w:lang w:bidi="ar-IQ"/>
+              </w:rPr>
+              <w:t>}}</w:t>
+            </w:r>
+          </w:p>
+        </w:tc>
+      </w:tr>
+      <w:tr>
+        <w:tc>
+          <w:tcPr>
+            <w:tcW w:w="4265" w:type="dxa"/>
+          </w:tcPr>
+          <w:p>
+            <w:pPr>
+              <w:keepNext/>
+              <w:spacing w:line="240" w:lineRule="auto"/>
+              <w:rPr>
+                <w:rFonts w:asciiTheme="minorBidi" w:hAnsiTheme="minorBidi" w:cstheme="minorBidi"/>
+                <w:b/>
+                <w:bCs/>
+                <w:sz w:val="24"/>
+                <w:szCs w:val="24"/>
+                <w:lang w:bidi="ar-IQ"/>
+              </w:rPr>
+            </w:pPr>
+            <w:r>
+              <w:rPr>
+                <w:rFonts w:asciiTheme="minorBidi" w:hAnsiTheme="minorBidi" w:cstheme="minorBidi"/>
+                <w:sz w:val="24"/>
+                <w:szCs w:val="24"/>
+                <w:rtl/>
+              </w:rPr>
+              <w:t>تاريخ التخرج:</w:t>
+            </w:r>
+            <w:r>
+              <w:rPr>
+                <w:rFonts w:asciiTheme="minorBidi" w:hAnsiTheme="minorBidi" w:cstheme="minorBidi"/>
+                <w:sz w:val="24"/>
+                <w:szCs w:val="24"/>
+                <w:rtl/>
+                <w:lang w:bidi="ar-IQ"/>
+              </w:rPr>
+              <w:t xml:space="preserve"> {{</w:t>
+            </w:r>
+            <w:r>
+              <w:rPr>
+                <w:rFonts w:asciiTheme="minorBidi" w:hAnsiTheme="minorBidi" w:cstheme="minorBidi"/>
+                <w:sz w:val="24"/>
+                <w:szCs w:val="24"/>
+                <w:lang w:bidi="ar-IQ"/>
+              </w:rPr>
+              <w:t>graduation_date</w:t>
+            </w:r>
+            <w:r>
+              <w:rPr>
+                <w:rFonts w:asciiTheme="minorBidi" w:hAnsiTheme="minorBidi" w:cstheme="minorBidi"/>
+                <w:sz w:val="24"/>
+                <w:szCs w:val="24"/>
+                <w:rtl/>
+                <w:lang w:bidi="ar-IQ"/>
+              </w:rPr>
+              <w:t>}}</w:t>
+            </w:r>
+          </w:p>
+        </w:tc>
+        <w:tc>
+          <w:tcPr>
+            <w:tcW w:w="1890" w:type="dxa"/>
+          </w:tcPr>
+          <w:p>
+            <w:pPr>
+              <w:keepNext/>
+              <w:spacing w:line="240" w:lineRule="auto"/>
+              <w:rPr>
+                <w:rFonts w:asciiTheme="minorBidi" w:hAnsiTheme="minorBidi" w:cstheme="minorBidi"/>
+                <w:b/>
+                <w:bCs/>
+                <w:sz w:val="24"/>
+                <w:szCs w:val="24"/>
+                <w:lang w:bidi="ar-IQ"/>
+              </w:rPr>
+            </w:pPr>
+            <w:r>
+              <w:rPr>
+                <w:rFonts w:asciiTheme="minorBidi" w:hAnsiTheme="minorBidi" w:cstheme="minorBidi" w:hint="cs"/>
+                <w:sz w:val="24"/>
+                <w:szCs w:val="24"/>
+                <w:rtl/>
+              </w:rPr>
+              <w:t>الدور/</w:t>
+            </w:r>
+            <w:r>
+              <w:rPr>
+                <w:rFonts w:asciiTheme="minorBidi" w:hAnsiTheme="minorBidi" w:cstheme="minorBidi"/>
+                <w:sz w:val="24"/>
+                <w:szCs w:val="24"/>
+                <w:rtl/>
+              </w:rPr>
+              <w:t xml:space="preserve">الفصل: </w:t>
+            </w:r>
+            <w:r>
+              <w:rPr>
+                <w:rFonts w:asciiTheme="minorBidi" w:hAnsiTheme="minorBidi" w:cstheme="minorBidi"/>
+                <w:sz w:val="24"/>
+                <w:szCs w:val="24"/>
+                <w:rtl/>
+                <w:lang w:bidi="ar-IQ"/>
+              </w:rPr>
+              <w:t>{{</w:t>
+            </w:r>
+            <w:r>
+              <w:rPr>
+                <w:rFonts w:asciiTheme="minorBidi" w:hAnsiTheme="minorBidi" w:cstheme="minorBidi"/>
+                <w:sz w:val="24"/>
+                <w:szCs w:val="24"/>
+                <w:lang w:bidi="ar-IQ"/>
+              </w:rPr>
+              <w:t>graduation_semester</w:t>
+            </w:r>
+            <w:r>
+              <w:rPr>
+                <w:rFonts w:asciiTheme="minorBidi" w:hAnsiTheme="minorBidi" w:cstheme="minorBidi"/>
+                <w:sz w:val="24"/>
+                <w:szCs w:val="24"/>
+                <w:rtl/>
+                <w:lang w:bidi="ar-IQ"/>
+              </w:rPr>
+              <w:t>}}</w:t>
+            </w:r>
+          </w:p>
+        </w:tc>
+        <w:tc>
+          <w:tcPr>
+            <w:tcW w:w="2451" w:type="dxa"/>
+          </w:tcPr>
+          <w:p>
+            <w:pPr>
+              <w:keepNext/>
+              <w:spacing w:line="240" w:lineRule="auto"/>
+              <w:rPr>
+                <w:rFonts w:asciiTheme="minorBidi" w:hAnsiTheme="minorBidi" w:cstheme="minorBidi"/>
+                <w:b/>
+                <w:bCs/>
+                <w:sz w:val="24"/>
+                <w:szCs w:val="24"/>
+                <w:lang w:bidi="ar-IQ"/>
+              </w:rPr>
+            </w:pPr>
+            <w:r>
+              <w:rPr>
+                <w:rFonts w:asciiTheme="minorBidi" w:hAnsiTheme="minorBidi" w:cstheme="minorBidi"/>
+                <w:sz w:val="24"/>
+                <w:szCs w:val="24"/>
+                <w:rtl/>
+              </w:rPr>
+              <w:t xml:space="preserve">المعدل: </w:t>
+            </w:r>
+            <w:r>
+              <w:rPr>
+                <w:rFonts w:asciiTheme="minorBidi" w:hAnsiTheme="minorBidi" w:cstheme="minorBidi"/>
+                <w:sz w:val="24"/>
+                <w:szCs w:val="24"/>
+                <w:rtl/>
+                <w:lang w:bidi="ar-IQ"/>
+              </w:rPr>
+              <w:t>{{</w:t>
+            </w:r>
+            <w:r>
+              <w:rPr>
+                <w:rFonts w:asciiTheme="minorBidi" w:hAnsiTheme="minorBidi" w:cstheme="minorBidi"/>
+                <w:sz w:val="24"/>
+                <w:szCs w:val="24"/>
+                <w:lang w:bidi="ar-IQ"/>
+              </w:rPr>
+              <w:t>average</w:t>
+            </w:r>
             <w:r>
               <w:rPr>
                 <w:rFonts w:asciiTheme="minorBidi" w:hAnsiTheme="minorBidi" w:cstheme="minorBidi"/>
@@ -519,290 +802,7 @@
           <w:p>
             <w:pPr>
               <w:keepNext/>
-              <w:spacing w:after="0" w:line="240" w:lineRule="auto"/>
-              <w:rPr>
-                <w:rFonts w:asciiTheme="minorBidi" w:hAnsiTheme="minorBidi" w:cstheme="minorBidi"/>
-                <w:sz w:val="24"/>
-                <w:szCs w:val="24"/>
-                <w:lang w:bidi="ar-IQ"/>
-              </w:rPr>
-            </w:pPr>
-          </w:p>
-        </w:tc>
-      </w:tr>
-      <w:tr>
-        <w:tc>
-          <w:tcPr>
-            <w:tcW w:w="6237" w:type="dxa"/>
-            <w:gridSpan w:val="2"/>
-          </w:tcPr>
-          <w:p>
-            <w:pPr>
-              <w:keepNext/>
-              <w:spacing w:after="0" w:line="240" w:lineRule="auto"/>
-              <w:rPr>
-                <w:rFonts w:asciiTheme="minorBidi" w:hAnsiTheme="minorBidi" w:cstheme="minorBidi"/>
-                <w:b/>
-                <w:bCs/>
-                <w:sz w:val="24"/>
-                <w:szCs w:val="24"/>
-                <w:lang w:bidi="ar-IQ"/>
-              </w:rPr>
-            </w:pPr>
-            <w:r>
-              <w:rPr>
-                <w:rFonts w:asciiTheme="minorBidi" w:hAnsiTheme="minorBidi" w:cstheme="minorBidi"/>
-                <w:sz w:val="24"/>
-                <w:szCs w:val="24"/>
-                <w:rtl/>
-              </w:rPr>
-              <w:t>الدرجة: البكلوريوس في العلوم وتكنولوجيا المعلومات</w:t>
-            </w:r>
-          </w:p>
-        </w:tc>
-        <w:tc>
-          <w:tcPr>
-            <w:tcW w:w="4229" w:type="dxa"/>
-            <w:gridSpan w:val="2"/>
-          </w:tcPr>
-          <w:p>
-            <w:pPr>
-              <w:keepNext/>
-              <w:spacing w:after="0" w:line="240" w:lineRule="auto"/>
-              <w:rPr>
-                <w:rFonts w:asciiTheme="minorBidi" w:hAnsiTheme="minorBidi" w:cstheme="minorBidi"/>
-                <w:sz w:val="24"/>
-                <w:szCs w:val="24"/>
-                <w:lang w:bidi="ar-IQ"/>
-              </w:rPr>
-            </w:pPr>
-            <w:r>
-              <w:rPr>
-                <w:rFonts w:asciiTheme="minorBidi" w:hAnsiTheme="minorBidi" w:cstheme="minorBidi"/>
-                <w:sz w:val="24"/>
-                <w:szCs w:val="24"/>
-                <w:rtl/>
-              </w:rPr>
-              <w:t xml:space="preserve">الدراسة: </w:t>
-            </w:r>
-            <w:r>
-              <w:rPr>
-                <w:rFonts w:asciiTheme="minorBidi" w:hAnsiTheme="minorBidi" w:cstheme="minorBidi"/>
-                <w:sz w:val="24"/>
-                <w:szCs w:val="24"/>
-                <w:rtl/>
-                <w:lang w:bidi="ar-IQ"/>
-              </w:rPr>
-              <w:t xml:space="preserve"> {{</w:t>
-            </w:r>
-            <w:proofErr w:type="spellStart"/>
-            <w:r>
-              <w:rPr>
-                <w:rFonts w:asciiTheme="minorBidi" w:hAnsiTheme="minorBidi" w:cstheme="minorBidi"/>
-                <w:sz w:val="24"/>
-                <w:szCs w:val="24"/>
-                <w:lang w:bidi="ar-IQ"/>
-              </w:rPr>
-              <w:t>study_type</w:t>
-            </w:r>
-            <w:proofErr w:type="spellEnd"/>
-            <w:r>
-              <w:rPr>
-                <w:rFonts w:asciiTheme="minorBidi" w:hAnsiTheme="minorBidi" w:cstheme="minorBidi"/>
-                <w:sz w:val="24"/>
-                <w:szCs w:val="24"/>
-                <w:rtl/>
-                <w:lang w:bidi="ar-IQ"/>
-              </w:rPr>
-              <w:t>}}</w:t>
-            </w:r>
-          </w:p>
-        </w:tc>
-      </w:tr>
-      <w:tr>
-        <w:tc>
-          <w:tcPr>
-            <w:tcW w:w="3240" w:type="dxa"/>
-          </w:tcPr>
-          <w:p>
-            <w:pPr>
-              <w:keepNext/>
-              <w:spacing w:after="0" w:line="240" w:lineRule="auto"/>
-              <w:rPr>
-                <w:rFonts w:asciiTheme="minorBidi" w:hAnsiTheme="minorBidi" w:cstheme="minorBidi"/>
-                <w:b/>
-                <w:bCs/>
-                <w:sz w:val="24"/>
-                <w:szCs w:val="24"/>
-                <w:lang w:bidi="ar-IQ"/>
-              </w:rPr>
-            </w:pPr>
-            <w:r>
-              <w:rPr>
-                <w:rFonts w:asciiTheme="minorBidi" w:hAnsiTheme="minorBidi" w:cstheme="minorBidi"/>
-                <w:sz w:val="24"/>
-                <w:szCs w:val="24"/>
-                <w:rtl/>
-              </w:rPr>
-              <w:t>تاريخ التخرج:</w:t>
-            </w:r>
-            <w:r>
-              <w:rPr>
-                <w:rFonts w:asciiTheme="minorBidi" w:hAnsiTheme="minorBidi" w:cstheme="minorBidi"/>
-                <w:sz w:val="24"/>
-                <w:szCs w:val="24"/>
-                <w:rtl/>
-                <w:lang w:bidi="ar-IQ"/>
-              </w:rPr>
-              <w:t xml:space="preserve"> {{</w:t>
-            </w:r>
-            <w:proofErr w:type="spellStart"/>
-            <w:r>
-              <w:rPr>
-                <w:rFonts w:asciiTheme="minorBidi" w:hAnsiTheme="minorBidi" w:cstheme="minorBidi"/>
-                <w:sz w:val="24"/>
-                <w:szCs w:val="24"/>
-                <w:lang w:bidi="ar-IQ"/>
-              </w:rPr>
-              <w:t>graduation_date</w:t>
-            </w:r>
-            <w:proofErr w:type="spellEnd"/>
-            <w:r>
-              <w:rPr>
-                <w:rFonts w:asciiTheme="minorBidi" w:hAnsiTheme="minorBidi" w:cstheme="minorBidi"/>
-                <w:sz w:val="24"/>
-                <w:szCs w:val="24"/>
-                <w:rtl/>
-                <w:lang w:bidi="ar-IQ"/>
-              </w:rPr>
-              <w:t>}}</w:t>
-            </w:r>
-          </w:p>
-        </w:tc>
-        <w:tc>
-          <w:tcPr>
-            <w:tcW w:w="2997" w:type="dxa"/>
-          </w:tcPr>
-          <w:p>
-            <w:pPr>
-              <w:keepNext/>
-              <w:spacing w:after="0" w:line="240" w:lineRule="auto"/>
-              <w:rPr>
-                <w:rFonts w:asciiTheme="minorBidi" w:hAnsiTheme="minorBidi" w:cstheme="minorBidi"/>
-                <w:b/>
-                <w:bCs/>
-                <w:sz w:val="24"/>
-                <w:szCs w:val="24"/>
-                <w:lang w:bidi="ar-IQ"/>
-              </w:rPr>
-            </w:pPr>
-            <w:r>
-              <w:rPr>
-                <w:rFonts w:asciiTheme="minorBidi" w:hAnsiTheme="minorBidi" w:cstheme="minorBidi"/>
-                <w:sz w:val="24"/>
-                <w:szCs w:val="24"/>
-                <w:rtl/>
-              </w:rPr>
-              <w:t xml:space="preserve">الفصل: </w:t>
-            </w:r>
-            <w:r>
-              <w:rPr>
-                <w:rFonts w:asciiTheme="minorBidi" w:hAnsiTheme="minorBidi" w:cstheme="minorBidi"/>
-                <w:sz w:val="24"/>
-                <w:szCs w:val="24"/>
-                <w:rtl/>
-                <w:lang w:bidi="ar-IQ"/>
-              </w:rPr>
-              <w:t>{{</w:t>
-            </w:r>
-            <w:proofErr w:type="spellStart"/>
-            <w:r>
-              <w:rPr>
-                <w:rFonts w:asciiTheme="minorBidi" w:hAnsiTheme="minorBidi" w:cstheme="minorBidi"/>
-                <w:sz w:val="24"/>
-                <w:szCs w:val="24"/>
-                <w:lang w:bidi="ar-IQ"/>
-              </w:rPr>
-              <w:t>graduation_semester</w:t>
-            </w:r>
-            <w:proofErr w:type="spellEnd"/>
-            <w:r>
-              <w:rPr>
-                <w:rFonts w:asciiTheme="minorBidi" w:hAnsiTheme="minorBidi" w:cstheme="minorBidi"/>
-                <w:sz w:val="24"/>
-                <w:szCs w:val="24"/>
-                <w:rtl/>
-                <w:lang w:bidi="ar-IQ"/>
-              </w:rPr>
-              <w:t>}}</w:t>
-            </w:r>
-          </w:p>
-        </w:tc>
-        <w:tc>
-          <w:tcPr>
-            <w:tcW w:w="2369" w:type="dxa"/>
-          </w:tcPr>
-          <w:p>
-            <w:pPr>
-              <w:keepNext/>
-              <w:spacing w:after="0" w:line="240" w:lineRule="auto"/>
-              <w:rPr>
-                <w:rFonts w:asciiTheme="minorBidi" w:hAnsiTheme="minorBidi" w:cstheme="minorBidi"/>
-                <w:b/>
-                <w:bCs/>
-                <w:sz w:val="24"/>
-                <w:szCs w:val="24"/>
-                <w:lang w:bidi="ar-IQ"/>
-              </w:rPr>
-            </w:pPr>
-            <w:r>
-              <w:rPr>
-                <w:rFonts w:asciiTheme="minorBidi" w:hAnsiTheme="minorBidi" w:cstheme="minorBidi"/>
-                <w:sz w:val="24"/>
-                <w:szCs w:val="24"/>
-                <w:rtl/>
-              </w:rPr>
-              <w:t xml:space="preserve">المعدل: </w:t>
-            </w:r>
-            <w:r>
-              <w:rPr>
-                <w:rFonts w:asciiTheme="minorBidi" w:hAnsiTheme="minorBidi" w:cstheme="minorBidi"/>
-                <w:sz w:val="24"/>
-                <w:szCs w:val="24"/>
-                <w:rtl/>
-                <w:lang w:bidi="ar-IQ"/>
-              </w:rPr>
-              <w:t>{{</w:t>
-            </w:r>
-            <w:r>
-              <w:rPr>
-                <w:rFonts w:asciiTheme="minorBidi" w:hAnsiTheme="minorBidi" w:cstheme="minorBidi"/>
-                <w:sz w:val="24"/>
-                <w:szCs w:val="24"/>
-                <w:lang w:bidi="ar-IQ"/>
-              </w:rPr>
-              <w:t>average</w:t>
-            </w:r>
-            <w:r>
-              <w:rPr>
-                <w:rFonts w:asciiTheme="minorBidi" w:hAnsiTheme="minorBidi" w:cstheme="minorBidi"/>
-                <w:sz w:val="24"/>
-                <w:szCs w:val="24"/>
-                <w:rtl/>
-                <w:lang w:bidi="ar-IQ"/>
-              </w:rPr>
-              <w:t>}}</w:t>
-            </w:r>
-          </w:p>
-        </w:tc>
-        <w:tc>
-          <w:tcPr>
-            <w:tcW w:w="1860" w:type="dxa"/>
-          </w:tcPr>
-          <w:p>
-            <w:pPr>
-              <w:keepNext/>
-              <w:spacing w:after="0" w:line="240" w:lineRule="auto"/>
+              <w:spacing w:line="240" w:lineRule="auto"/>
               <w:rPr>
                 <w:rFonts w:asciiTheme="minorBidi" w:hAnsiTheme="minorBidi" w:cstheme="minorBidi"/>
                 <w:sz w:val="24"/>
@@ -856,12 +856,11 @@
           <w:tcPr>
             <w:tcW w:w="10466" w:type="dxa"/>
             <w:gridSpan w:val="4"/>
-            <w:vAlign w:val="center"/>
           </w:tcPr>
           <w:p>
             <w:pPr>
               <w:keepNext/>
-              <w:spacing w:after="0" w:line="240" w:lineRule="auto"/>
+              <w:spacing w:line="240" w:lineRule="auto"/>
               <w:rPr>
                 <w:rFonts w:asciiTheme="minorBidi" w:hAnsiTheme="minorBidi" w:cstheme="minorBidi"/>
                 <w:sz w:val="24"/>
@@ -885,28 +884,8 @@
                 <w:szCs w:val="24"/>
                 <w:lang w:bidi="ar-IQ"/>
               </w:rPr>
-              <w:t>tr</w:t>
-            </w:r>
-            <w:r>
-              <w:rPr>
-                <w:rFonts w:asciiTheme="minorBidi" w:hAnsiTheme="minorBidi" w:cstheme="minorBidi"/>
-                <w:sz w:val="24"/>
-                <w:szCs w:val="24"/>
-                <w:lang w:bidi="ar-IQ"/>
-              </w:rPr>
-              <w:t xml:space="preserve"> if </w:t>
-            </w:r>
-            <w:proofErr w:type="spellStart"/>
-            <w:r>
-              <w:rPr>
-                <w:rFonts w:asciiTheme="minorBidi" w:hAnsiTheme="minorBidi" w:cstheme="minorBidi"/>
-                <w:sz w:val="24"/>
-                <w:szCs w:val="24"/>
-                <w:lang w:bidi="ar-IQ"/>
-              </w:rPr>
-              <w:t>sequence_ON</w:t>
-            </w:r>
-            <w:proofErr w:type="spellEnd"/>
+              <w:t>tr if sequence_ON</w:t>
+            </w:r>
             <w:r>
               <w:rPr>
                 <w:rFonts w:asciiTheme="minorBidi" w:hAnsiTheme="minorBidi" w:cstheme="minorBidi"/>
@@ -923,13 +902,11 @@
       <w:tr>
         <w:tc>
           <w:tcPr>
-            <w:tcW w:w="3240" w:type="dxa"/>
-            <w:vAlign w:val="center"/>
+            <w:tcW w:w="4265" w:type="dxa"/>
           </w:tcPr>
           <w:p>
             <w:pPr>
               <w:keepNext/>
-              <w:spacing w:after="0"/>
               <w:rPr>
                 <w:rFonts w:asciiTheme="minorBidi" w:hAnsiTheme="minorBidi" w:cstheme="minorBidi"/>
                 <w:sz w:val="24"/>
@@ -939,12 +916,21 @@
             </w:pPr>
             <w:r>
               <w:rPr>
+                <w:rFonts w:asciiTheme="minorBidi" w:hAnsiTheme="minorBidi" w:cstheme="minorBidi" w:hint="cs"/>
+                <w:sz w:val="24"/>
+                <w:szCs w:val="24"/>
+                <w:rtl/>
+              </w:rPr>
+              <w:t>تسلسل</w:t>
+            </w:r>
+            <w:r>
+              <w:rPr>
                 <w:rFonts w:asciiTheme="minorBidi" w:hAnsiTheme="minorBidi" w:cstheme="minorBidi"/>
                 <w:sz w:val="24"/>
                 <w:szCs w:val="24"/>
                 <w:rtl/>
               </w:rPr>
-              <w:t xml:space="preserve">رتبة الخريج: </w:t>
+              <w:t xml:space="preserve"> الخريج: </w:t>
             </w:r>
             <w:r>
               <w:rPr>
@@ -956,7 +942,6 @@
               </w:rPr>
               <w:t>{{</w:t>
             </w:r>
-            <w:proofErr w:type="spellStart"/>
             <w:r>
               <w:rPr>
                 <w:rFonts w:asciiTheme="minorBidi" w:hAnsiTheme="minorBidi" w:cstheme="minorBidi"/>
@@ -966,7 +951,6 @@
               </w:rPr>
               <w:t>Sequence_of_Graduation</w:t>
             </w:r>
-            <w:proofErr w:type="spellEnd"/>
             <w:r>
               <w:rPr>
                 <w:rFonts w:asciiTheme="minorBidi" w:hAnsiTheme="minorBidi" w:cstheme="minorBidi"/>
@@ -981,13 +965,12 @@
         </w:tc>
         <w:tc>
           <w:tcPr>
-            <w:tcW w:w="2997" w:type="dxa"/>
-            <w:vAlign w:val="center"/>
+            <w:tcW w:w="1890" w:type="dxa"/>
           </w:tcPr>
           <w:p>
             <w:pPr>
               <w:keepNext/>
-              <w:spacing w:after="0" w:line="240" w:lineRule="auto"/>
+              <w:spacing w:line="240" w:lineRule="auto"/>
               <w:rPr>
                 <w:rFonts w:asciiTheme="minorBidi" w:hAnsiTheme="minorBidi" w:cstheme="minorBidi"/>
                 <w:sz w:val="24"/>
@@ -1014,7 +997,6 @@
               </w:rPr>
               <w:t xml:space="preserve"> {{</w:t>
             </w:r>
-            <w:proofErr w:type="spellStart"/>
             <w:r>
               <w:rPr>
                 <w:rFonts w:asciiTheme="minorBidi" w:hAnsiTheme="minorBidi" w:cstheme="minorBidi"/>
@@ -1024,7 +1006,6 @@
               </w:rPr>
               <w:t>num_students</w:t>
             </w:r>
-            <w:proofErr w:type="spellEnd"/>
             <w:r>
               <w:rPr>
                 <w:rFonts w:asciiTheme="minorBidi" w:hAnsiTheme="minorBidi" w:cstheme="minorBidi"/>
@@ -1039,14 +1020,12 @@
         </w:tc>
         <w:tc>
           <w:tcPr>
-            <w:tcW w:w="4229" w:type="dxa"/>
+            <w:tcW w:w="4311" w:type="dxa"/>
             <w:gridSpan w:val="2"/>
-            <w:vAlign w:val="center"/>
           </w:tcPr>
           <w:p>
             <w:pPr>
               <w:keepNext/>
-              <w:spacing w:after="0"/>
               <w:rPr>
                 <w:rFonts w:asciiTheme="minorBidi" w:hAnsiTheme="minorBidi" w:cstheme="minorBidi"/>
                 <w:sz w:val="24"/>
@@ -1072,7 +1051,6 @@
               </w:rPr>
               <w:t xml:space="preserve"> {{</w:t>
             </w:r>
-            <w:proofErr w:type="spellStart"/>
             <w:r>
               <w:rPr>
                 <w:rFonts w:asciiTheme="minorBidi" w:hAnsiTheme="minorBidi" w:cstheme="minorBidi"/>
@@ -1082,7 +1060,6 @@
               </w:rPr>
               <w:t>Average_of_First_Student</w:t>
             </w:r>
-            <w:proofErr w:type="spellEnd"/>
             <w:r>
               <w:rPr>
                 <w:rFonts w:asciiTheme="minorBidi" w:hAnsiTheme="minorBidi" w:cstheme="minorBidi"/>
@@ -1101,12 +1078,10 @@
           <w:tcPr>
             <w:tcW w:w="10466" w:type="dxa"/>
             <w:gridSpan w:val="4"/>
-            <w:vAlign w:val="center"/>
           </w:tcPr>
           <w:p>
             <w:pPr>
               <w:keepNext/>
-              <w:spacing w:after="0"/>
               <w:rPr>
                 <w:rFonts w:asciiTheme="minorBidi" w:hAnsiTheme="minorBidi" w:cstheme="minorBidi"/>
                 <w:sz w:val="24"/>
@@ -1131,16 +1106,7 @@
                 <w:szCs w:val="24"/>
                 <w:lang w:bidi="ar-IQ"/>
               </w:rPr>
-              <w:t>tr</w:t>
-            </w:r>
-            <w:r>
-              <w:rPr>
-                <w:rFonts w:asciiTheme="minorBidi" w:hAnsiTheme="minorBidi" w:cstheme="minorBidi"/>
-                <w:sz w:val="24"/>
-                <w:szCs w:val="24"/>
-                <w:lang w:bidi="ar-IQ"/>
-              </w:rPr>
-              <w:t xml:space="preserve"> endif</w:t>
+              <w:t>tr endif</w:t>
             </w:r>
             <w:r>
               <w:rPr>
@@ -1160,13 +1126,13 @@
       <w:pPr>
         <w:keepNext/>
         <w:keepLines/>
-        <w:spacing w:after="0" w:line="240" w:lineRule="auto"/>
+        <w:spacing w:before="240" w:after="0" w:line="240" w:lineRule="auto"/>
         <w:rPr>
           <w:rFonts w:asciiTheme="majorBidi" w:hAnsiTheme="majorBidi" w:cstheme="majorBidi"/>
           <w:b/>
           <w:bCs/>
-          <w:sz w:val="18"/>
-          <w:szCs w:val="18"/>
+          <w:sz w:val="20"/>
+          <w:szCs w:val="20"/>
           <w:rtl/>
         </w:rPr>
       </w:pPr>
@@ -1175,11 +1141,33 @@
           <w:rFonts w:asciiTheme="majorBidi" w:hAnsiTheme="majorBidi" w:cstheme="majorBidi"/>
           <w:b/>
           <w:bCs/>
-          <w:sz w:val="18"/>
-          <w:szCs w:val="18"/>
-          <w:rtl/>
-        </w:rPr>
-        <w:t>ملاحظة: توجد معلومات إضافية على ظهر الوثيقة.</w:t>
+          <w:sz w:val="20"/>
+          <w:szCs w:val="20"/>
+          <w:rtl/>
+        </w:rPr>
+        <w:t xml:space="preserve">ملاحظة: معلومات </w:t>
+      </w:r>
+      <w:r>
+        <w:rPr>
+          <w:rFonts w:asciiTheme="majorBidi" w:hAnsiTheme="majorBidi" w:cstheme="majorBidi" w:hint="cs"/>
+          <w:b/>
+          <w:bCs/>
+          <w:sz w:val="20"/>
+          <w:szCs w:val="20"/>
+          <w:rtl/>
+        </w:rPr>
+        <w:t>اخرى في</w:t>
+      </w:r>
+      <w:r>
+        <w:rPr>
+          <w:rFonts w:asciiTheme="majorBidi" w:hAnsiTheme="majorBidi" w:cstheme="majorBidi"/>
+          <w:b/>
+          <w:bCs/>
+          <w:sz w:val="20"/>
+          <w:szCs w:val="20"/>
+          <w:rtl/>
+        </w:rPr>
+        <w:t xml:space="preserve"> ظهر الوثيقة.</w:t>
       </w:r>
     </w:p>
     <w:p>
@@ -1191,21 +1179,215 @@
           <w:rFonts w:asciiTheme="majorBidi" w:hAnsiTheme="majorBidi" w:cstheme="majorBidi"/>
           <w:b/>
           <w:bCs/>
-          <w:sz w:val="18"/>
-          <w:szCs w:val="18"/>
-          <w:rtl/>
-        </w:rPr>
-      </w:pPr>
-      <w:r>
-        <w:rPr>
-          <w:rFonts w:asciiTheme="majorBidi" w:hAnsiTheme="majorBidi" w:cstheme="majorBidi"/>
+          <w:sz w:val="20"/>
+          <w:szCs w:val="20"/>
+          <w:rtl/>
+        </w:rPr>
+      </w:pPr>
+      <w:r>
+        <w:rPr>
+          <w:rFonts w:asciiTheme="majorBidi" w:hAnsiTheme="majorBidi" w:cstheme="majorBidi" w:hint="cs"/>
           <w:b/>
           <w:bCs/>
-          <w:sz w:val="18"/>
-          <w:szCs w:val="18"/>
-          <w:rtl/>
-        </w:rPr>
-        <w:t>فيما يلي السجل الأكاديمي الرسمي للمواد الدراسية والدرجات التي تم الحصول عليها خلال سنوات الدراسة.</w:t>
+          <w:sz w:val="20"/>
+          <w:szCs w:val="20"/>
+          <w:rtl/>
+        </w:rPr>
+        <w:t>ادناه</w:t>
+      </w:r>
+      <w:r>
+        <w:rPr>
+          <w:rFonts w:asciiTheme="majorBidi" w:hAnsiTheme="majorBidi" w:cstheme="majorBidi"/>
+          <w:b/>
+          <w:bCs/>
+          <w:sz w:val="20"/>
+          <w:szCs w:val="20"/>
+          <w:rtl/>
+        </w:rPr>
+        <w:t xml:space="preserve"> </w:t>
+      </w:r>
+      <w:r>
+        <w:rPr>
+          <w:rFonts w:asciiTheme="majorBidi" w:hAnsiTheme="majorBidi" w:cstheme="majorBidi" w:hint="cs"/>
+          <w:b/>
+          <w:bCs/>
+          <w:sz w:val="20"/>
+          <w:szCs w:val="20"/>
+          <w:rtl/>
+        </w:rPr>
+        <w:t>ا</w:t>
+      </w:r>
+      <w:r>
+        <w:rPr>
+          <w:rFonts w:asciiTheme="majorBidi" w:hAnsiTheme="majorBidi" w:cstheme="majorBidi"/>
+          <w:b/>
+          <w:bCs/>
+          <w:sz w:val="20"/>
+          <w:szCs w:val="20"/>
+          <w:rtl/>
+        </w:rPr>
+        <w:t>لمواد الدراسية والدرجات التي حصل عليها خلال سنوات الدراسة.</w:t>
+      </w:r>
+    </w:p>
+    <w:p>
+      <w:pPr>
+        <w:rPr>
+          <w:rFonts w:asciiTheme="majorBidi" w:hAnsiTheme="majorBidi" w:cstheme="majorBidi"/>
+          <w:lang w:bidi="ar-IQ"/>
+        </w:rPr>
+      </w:pPr>
+      <w:r>
+        <w:rPr>
+          <w:rFonts w:asciiTheme="majorBidi" w:hAnsiTheme="majorBidi" w:cstheme="majorBidi"/>
+          <w:rtl/>
+          <w:lang w:bidi="ar-IQ"/>
+        </w:rPr>
+        <w:t xml:space="preserve">{% </w:t>
+      </w:r>
+      <w:r>
+        <w:rPr>
+          <w:rFonts w:asciiTheme="majorBidi" w:hAnsiTheme="majorBidi" w:cstheme="majorBidi"/>
+          <w:lang w:bidi="ar-IQ"/>
+        </w:rPr>
+        <w:t>for pair in paired_</w:t>
+      </w:r>
+      <w:r>
+        <w:rPr>
+          <w:rFonts w:asciiTheme="majorBidi" w:hAnsiTheme="majorBidi" w:cstheme="majorBidi"/>
+          <w:lang w:bidi="ar-IQ"/>
+        </w:rPr>
+        <w:t>year</w:t>
+      </w:r>
+      <w:r>
+        <w:rPr>
+          <w:rFonts w:asciiTheme="majorBidi" w:hAnsiTheme="majorBidi" w:cstheme="majorBidi"/>
+          <w:lang w:bidi="ar-IQ"/>
+        </w:rPr>
+        <w:t>s</w:t>
+      </w:r>
+      <w:r>
+        <w:rPr>
+          <w:rFonts w:asciiTheme="majorBidi" w:hAnsiTheme="majorBidi" w:cstheme="majorBidi"/>
+          <w:rtl/>
+          <w:lang w:bidi="ar-IQ"/>
+        </w:rPr>
+        <w:t xml:space="preserve"> %}</w:t>
+      </w:r>
+    </w:p>
+    <w:p>
+      <w:pPr>
+        <w:rPr>
+          <w:rFonts w:asciiTheme="majorBidi" w:hAnsiTheme="majorBidi" w:cstheme="majorBidi"/>
+          <w:sz w:val="24"/>
+          <w:szCs w:val="24"/>
+          <w:lang w:bidi="ar-IQ"/>
+        </w:rPr>
+      </w:pPr>
+      <w:r>
+        <w:rPr>
+          <w:rFonts w:asciiTheme="majorBidi" w:hAnsiTheme="majorBidi" w:cstheme="majorBidi"/>
+          <w:sz w:val="24"/>
+          <w:szCs w:val="24"/>
+          <w:rtl/>
+          <w:lang w:bidi="ar-IQ"/>
+        </w:rPr>
+        <w:t>{%</w:t>
+      </w:r>
+      <w:r>
+        <w:rPr>
+          <w:rFonts w:asciiTheme="majorBidi" w:hAnsiTheme="majorBidi" w:cstheme="majorBidi"/>
+          <w:sz w:val="24"/>
+          <w:szCs w:val="24"/>
+          <w:lang w:bidi="ar-IQ"/>
+        </w:rPr>
+        <w:t xml:space="preserve">p if </w:t>
+      </w:r>
+      <w:r>
+        <w:rPr>
+          <w:rFonts w:asciiTheme="majorBidi" w:hAnsiTheme="majorBidi" w:cstheme="majorBidi"/>
+          <w:lang w:bidi="ar-IQ"/>
+        </w:rPr>
+        <w:t>not_first_page</w:t>
+      </w:r>
+      <w:r>
+        <w:rPr>
+          <w:rFonts w:asciiTheme="majorBidi" w:hAnsiTheme="majorBidi" w:cstheme="majorBidi"/>
+          <w:sz w:val="24"/>
+          <w:szCs w:val="24"/>
+          <w:rtl/>
+          <w:lang w:bidi="ar-IQ"/>
+        </w:rPr>
+        <w:t xml:space="preserve"> %}</w:t>
+      </w:r>
+    </w:p>
+    <w:p>
+      <w:pPr>
+        <w:rPr>
+          <w:rFonts w:asciiTheme="minorBidi" w:hAnsiTheme="minorBidi" w:cstheme="minorBidi"/>
+          <w:sz w:val="24"/>
+          <w:szCs w:val="24"/>
+          <w:lang w:bidi="ar-IQ"/>
+        </w:rPr>
+      </w:pPr>
+      <w:r>
+        <w:rPr>
+          <w:rFonts w:asciiTheme="minorBidi" w:hAnsiTheme="minorBidi" w:cstheme="minorBidi"/>
+          <w:sz w:val="24"/>
+          <w:szCs w:val="24"/>
+          <w:rtl/>
+          <w:lang w:bidi="ar-IQ"/>
+        </w:rPr>
+        <w:t>{{</w:t>
+      </w:r>
+      <w:r>
+        <w:rPr>
+          <w:rFonts w:asciiTheme="minorBidi" w:hAnsiTheme="minorBidi" w:cstheme="minorBidi"/>
+          <w:sz w:val="24"/>
+          <w:szCs w:val="24"/>
+          <w:lang w:bidi="ar-IQ"/>
+        </w:rPr>
+        <w:t>student_name</w:t>
+      </w:r>
+      <w:r>
+        <w:rPr>
+          <w:rFonts w:asciiTheme="minorBidi" w:hAnsiTheme="minorBidi" w:cstheme="minorBidi"/>
+          <w:sz w:val="24"/>
+          <w:szCs w:val="24"/>
+          <w:rtl/>
+          <w:lang w:bidi="ar-IQ"/>
+        </w:rPr>
+        <w:t>}}</w:t>
+      </w:r>
+    </w:p>
+    <w:p>
+      <w:pPr>
+        <w:rPr>
+          <w:rFonts w:asciiTheme="majorBidi" w:hAnsiTheme="majorBidi" w:cstheme="majorBidi"/>
+          <w:lang w:bidi="ar-IQ"/>
+        </w:rPr>
+      </w:pPr>
+      <w:r>
+        <w:rPr>
+          <w:rFonts w:asciiTheme="majorBidi" w:hAnsiTheme="majorBidi" w:cstheme="majorBidi"/>
+          <w:rtl/>
+          <w:lang w:bidi="ar-IQ"/>
+        </w:rPr>
+        <w:t>{%</w:t>
+      </w:r>
+      <w:r>
+        <w:rPr>
+          <w:rFonts w:asciiTheme="majorBidi" w:hAnsiTheme="majorBidi" w:cstheme="majorBidi"/>
+          <w:lang w:bidi="ar-IQ"/>
+        </w:rPr>
+        <w:t>p endif</w:t>
+      </w:r>
+      <w:r>
+        <w:rPr>
+          <w:rFonts w:asciiTheme="majorBidi" w:hAnsiTheme="majorBidi" w:cstheme="majorBidi"/>
+          <w:rtl/>
+          <w:lang w:bidi="ar-IQ"/>
+        </w:rPr>
+        <w:t xml:space="preserve"> %}</w:t>
       </w:r>
     </w:p>
     <w:p>
@@ -1218,52 +1400,6 @@
           <w:lang w:bidi="ar-IQ"/>
         </w:rPr>
       </w:pPr>
-      <w:r>
-        <w:rPr>
-          <w:rFonts w:asciiTheme="majorBidi" w:hAnsiTheme="majorBidi" w:cstheme="majorBidi"/>
-          <w:rtl/>
-          <w:lang w:bidi="ar-IQ"/>
-        </w:rPr>
-        <w:t xml:space="preserve">{% </w:t>
-      </w:r>
-      <w:r>
-        <w:rPr>
-          <w:rFonts w:asciiTheme="majorBidi" w:hAnsiTheme="majorBidi" w:cstheme="majorBidi"/>
-          <w:lang w:bidi="ar-IQ"/>
-        </w:rPr>
-        <w:t xml:space="preserve">for pair in </w:t>
-      </w:r>
-      <w:proofErr w:type="spellStart"/>
-      <w:r>
-        <w:rPr>
-          <w:rFonts w:asciiTheme="majorBidi" w:hAnsiTheme="majorBidi" w:cstheme="majorBidi"/>
-          <w:lang w:bidi="ar-IQ"/>
-        </w:rPr>
-        <w:t>paired_</w:t>
-      </w:r>
-      <w:r>
-        <w:rPr>
-          <w:rFonts w:asciiTheme="majorBidi" w:hAnsiTheme="majorBidi" w:cstheme="majorBidi"/>
-          <w:lang w:bidi="ar-IQ"/>
-        </w:rPr>
-        <w:t>year</w:t>
-      </w:r>
-      <w:r>
-        <w:rPr>
-          <w:rFonts w:asciiTheme="majorBidi" w:hAnsiTheme="majorBidi" w:cstheme="majorBidi"/>
-          <w:lang w:bidi="ar-IQ"/>
-        </w:rPr>
-        <w:t>s</w:t>
-      </w:r>
-      <w:proofErr w:type="spellEnd"/>
-      <w:r>
-        <w:rPr>
-          <w:rFonts w:asciiTheme="majorBidi" w:hAnsiTheme="majorBidi" w:cstheme="majorBidi"/>
-          <w:rtl/>
-          <w:lang w:bidi="ar-IQ"/>
-        </w:rPr>
-        <w:t xml:space="preserve"> %}</w:t>
-      </w:r>
     </w:p>
     <w:tbl>
       <w:tblPr>
@@ -1274,9 +1410,10 @@
         <w:tblLook w:val="04A0" w:firstRow="1" w:lastRow="0" w:firstColumn="1" w:lastColumn="0" w:noHBand="0" w:noVBand="1"/>
       </w:tblPr>
       <w:tblGrid>
-        <w:gridCol w:w="3822"/>
+        <w:gridCol w:w="3823"/>
         <w:gridCol w:w="707"/>
-        <w:gridCol w:w="709"/>
+        <w:gridCol w:w="698"/>
+        <w:gridCol w:w="10"/>
         <w:gridCol w:w="3829"/>
         <w:gridCol w:w="709"/>
         <w:gridCol w:w="680"/>
@@ -1288,7 +1425,7 @@
         <w:tc>
           <w:tcPr>
             <w:tcW w:w="2505" w:type="pct"/>
-            <w:gridSpan w:val="3"/>
+            <w:gridSpan w:val="4"/>
           </w:tcPr>
           <w:p>
             <w:pPr>
@@ -1312,7 +1449,6 @@
               </w:rPr>
               <w:t>{{</w:t>
             </w:r>
-            <w:proofErr w:type="spellStart"/>
             <w:r>
               <w:rPr>
                 <w:rFonts w:asciiTheme="majorBidi" w:hAnsiTheme="majorBidi" w:cstheme="majorBidi"/>
@@ -1340,7 +1476,6 @@
               </w:rPr>
               <w:t>right_label</w:t>
             </w:r>
-            <w:proofErr w:type="spellEnd"/>
             <w:r>
               <w:rPr>
                 <w:rFonts w:asciiTheme="majorBidi" w:hAnsiTheme="majorBidi" w:cstheme="majorBidi"/>
@@ -1377,9 +1512,8 @@
                 <w:szCs w:val="18"/>
                 <w:lang w:bidi="ar-IQ"/>
               </w:rPr>
-              <w:t xml:space="preserve"> </w:t>
-            </w:r>
-            <w:proofErr w:type="spellStart"/>
+              <w:t xml:space="preserve"> pair.</w:t>
+            </w:r>
             <w:r>
               <w:rPr>
                 <w:rFonts w:asciiTheme="majorBidi" w:hAnsiTheme="majorBidi" w:cstheme="majorBidi"/>
@@ -1387,26 +1521,7 @@
                 <w:szCs w:val="18"/>
                 <w:lang w:bidi="ar-IQ"/>
               </w:rPr>
-              <w:t>pair.</w:t>
-            </w:r>
-            <w:r>
-              <w:rPr>
-                <w:rFonts w:asciiTheme="majorBidi" w:hAnsiTheme="majorBidi" w:cstheme="majorBidi"/>
-                <w:sz w:val="18"/>
-                <w:szCs w:val="18"/>
-                <w:lang w:bidi="ar-IQ"/>
-              </w:rPr>
-              <w:t>num_s_r</w:t>
-            </w:r>
-            <w:proofErr w:type="spellEnd"/>
-            <w:r>
-              <w:rPr>
-                <w:rFonts w:asciiTheme="majorBidi" w:hAnsiTheme="majorBidi" w:cstheme="majorBidi"/>
-                <w:sz w:val="18"/>
-                <w:szCs w:val="18"/>
-                <w:lang w:bidi="ar-IQ"/>
-              </w:rPr>
-              <w:t>}}</w:t>
+              <w:t>num_s_r}}</w:t>
             </w:r>
           </w:p>
         </w:tc>
@@ -1436,7 +1551,6 @@
               </w:rPr>
               <w:t>{{</w:t>
             </w:r>
-            <w:proofErr w:type="spellStart"/>
             <w:r>
               <w:rPr>
                 <w:rFonts w:asciiTheme="majorBidi" w:hAnsiTheme="majorBidi" w:cstheme="majorBidi"/>
@@ -1464,7 +1578,6 @@
               </w:rPr>
               <w:t>left_label</w:t>
             </w:r>
-            <w:proofErr w:type="spellEnd"/>
             <w:r>
               <w:rPr>
                 <w:rFonts w:asciiTheme="majorBidi" w:hAnsiTheme="majorBidi" w:cstheme="majorBidi"/>
@@ -1521,9 +1634,8 @@
                 <w:szCs w:val="18"/>
                 <w:lang w:bidi="ar-IQ"/>
               </w:rPr>
-              <w:t xml:space="preserve"> </w:t>
-            </w:r>
-            <w:proofErr w:type="spellStart"/>
+              <w:t xml:space="preserve"> pair.</w:t>
+            </w:r>
             <w:r>
               <w:rPr>
                 <w:rFonts w:asciiTheme="majorBidi" w:hAnsiTheme="majorBidi" w:cstheme="majorBidi"/>
@@ -1531,26 +1643,7 @@
                 <w:szCs w:val="18"/>
                 <w:lang w:bidi="ar-IQ"/>
               </w:rPr>
-              <w:t>pair.</w:t>
-            </w:r>
-            <w:r>
-              <w:rPr>
-                <w:rFonts w:asciiTheme="majorBidi" w:hAnsiTheme="majorBidi" w:cstheme="majorBidi"/>
-                <w:sz w:val="18"/>
-                <w:szCs w:val="18"/>
-                <w:lang w:bidi="ar-IQ"/>
-              </w:rPr>
-              <w:t>num_s_l</w:t>
-            </w:r>
-            <w:proofErr w:type="spellEnd"/>
-            <w:r>
-              <w:rPr>
-                <w:rFonts w:asciiTheme="majorBidi" w:hAnsiTheme="majorBidi" w:cstheme="majorBidi"/>
-                <w:sz w:val="18"/>
-                <w:szCs w:val="18"/>
-                <w:lang w:bidi="ar-IQ"/>
-              </w:rPr>
-              <w:t>}}</w:t>
+              <w:t>num_s_l}}</w:t>
             </w:r>
           </w:p>
         </w:tc>
@@ -1624,6 +1717,7 @@
         <w:tc>
           <w:tcPr>
             <w:tcW w:w="339" w:type="pct"/>
+            <w:gridSpan w:val="2"/>
           </w:tcPr>
           <w:p>
             <w:pPr>
@@ -1752,7 +1846,7 @@
         <w:tc>
           <w:tcPr>
             <w:tcW w:w="5000" w:type="pct"/>
-            <w:gridSpan w:val="6"/>
+            <w:gridSpan w:val="7"/>
           </w:tcPr>
           <w:p>
             <w:pPr>
@@ -1782,19 +1876,8 @@
                 <w:szCs w:val="18"/>
                 <w:lang w:bidi="ar-IQ"/>
               </w:rPr>
-              <w:t xml:space="preserve">tr for row in </w:t>
-            </w:r>
-            <w:proofErr w:type="spellStart"/>
-            <w:r>
-              <w:rPr>
-                <w:rFonts w:asciiTheme="majorBidi" w:hAnsiTheme="majorBidi" w:cstheme="majorBidi"/>
-                <w:sz w:val="18"/>
-                <w:szCs w:val="18"/>
-                <w:lang w:bidi="ar-IQ"/>
-              </w:rPr>
-              <w:t>pair.rows</w:t>
-            </w:r>
-            <w:proofErr w:type="spellEnd"/>
+              <w:t>tr for row in pair.rows</w:t>
+            </w:r>
             <w:r>
               <w:rPr>
                 <w:rFonts w:asciiTheme="majorBidi" w:hAnsiTheme="majorBidi" w:cstheme="majorBidi"/>
@@ -1838,7 +1921,6 @@
               </w:rPr>
               <w:t>{{</w:t>
             </w:r>
-            <w:proofErr w:type="spellStart"/>
             <w:r>
               <w:rPr>
                 <w:rFonts w:asciiTheme="majorBidi" w:hAnsiTheme="majorBidi" w:cstheme="majorBidi"/>
@@ -1848,7 +1930,6 @@
               </w:rPr>
               <w:t>row.right_subj</w:t>
             </w:r>
-            <w:proofErr w:type="spellEnd"/>
             <w:r>
               <w:rPr>
                 <w:rFonts w:asciiTheme="majorBidi" w:hAnsiTheme="majorBidi" w:cstheme="majorBidi"/>
@@ -1887,7 +1968,6 @@
               </w:rPr>
               <w:t>{{</w:t>
             </w:r>
-            <w:proofErr w:type="spellStart"/>
             <w:r>
               <w:rPr>
                 <w:rFonts w:asciiTheme="majorBidi" w:hAnsiTheme="majorBidi" w:cstheme="majorBidi"/>
@@ -1897,7 +1977,101 @@
               </w:rPr>
               <w:t>row.right_mark</w:t>
             </w:r>
-            <w:proofErr w:type="spellEnd"/>
+            <w:r>
+              <w:rPr>
+                <w:rFonts w:asciiTheme="majorBidi" w:hAnsiTheme="majorBidi" w:cstheme="majorBidi"/>
+                <w:sz w:val="18"/>
+                <w:szCs w:val="18"/>
+                <w:rtl/>
+                <w:lang w:bidi="ar-IQ"/>
+              </w:rPr>
+              <w:t>}}</w:t>
+            </w:r>
+          </w:p>
+        </w:tc>
+        <w:tc>
+          <w:tcPr>
+            <w:tcW w:w="339" w:type="pct"/>
+            <w:gridSpan w:val="2"/>
+          </w:tcPr>
+          <w:p>
+            <w:pPr>
+              <w:keepNext/>
+              <w:keepLines/>
+              <w:spacing w:after="0"/>
+              <w:rPr>
+                <w:rFonts w:asciiTheme="majorBidi" w:hAnsiTheme="majorBidi" w:cstheme="majorBidi"/>
+                <w:sz w:val="18"/>
+                <w:szCs w:val="18"/>
+                <w:lang w:bidi="ar-IQ"/>
+              </w:rPr>
+            </w:pPr>
+            <w:r>
+              <w:rPr>
+                <w:rFonts w:asciiTheme="majorBidi" w:hAnsiTheme="majorBidi" w:cstheme="majorBidi"/>
+                <w:sz w:val="18"/>
+                <w:szCs w:val="18"/>
+                <w:rtl/>
+                <w:lang w:bidi="ar-IQ"/>
+              </w:rPr>
+              <w:t>{{</w:t>
+            </w:r>
+            <w:r>
+              <w:rPr>
+                <w:rFonts w:asciiTheme="majorBidi" w:hAnsiTheme="majorBidi" w:cstheme="majorBidi"/>
+                <w:sz w:val="18"/>
+                <w:szCs w:val="18"/>
+                <w:lang w:bidi="ar-IQ"/>
+              </w:rPr>
+              <w:t>row.right_unit</w:t>
+            </w:r>
+            <w:r>
+              <w:rPr>
+                <w:rFonts w:asciiTheme="majorBidi" w:hAnsiTheme="majorBidi" w:cstheme="majorBidi"/>
+                <w:sz w:val="18"/>
+                <w:szCs w:val="18"/>
+                <w:rtl/>
+                <w:lang w:bidi="ar-IQ"/>
+              </w:rPr>
+              <w:t>}}</w:t>
+            </w:r>
+          </w:p>
+        </w:tc>
+        <w:tc>
+          <w:tcPr>
+            <w:tcW w:w="1831" w:type="pct"/>
+          </w:tcPr>
+          <w:p>
+            <w:pPr>
+              <w:keepNext/>
+              <w:keepLines/>
+              <w:spacing w:after="0"/>
+              <w:rPr>
+                <w:rFonts w:asciiTheme="majorBidi" w:hAnsiTheme="majorBidi" w:cstheme="majorBidi"/>
+                <w:sz w:val="18"/>
+                <w:szCs w:val="18"/>
+                <w:lang w:bidi="ar-IQ"/>
+              </w:rPr>
+            </w:pPr>
+            <w:r>
+              <w:rPr>
+                <w:rFonts w:asciiTheme="majorBidi" w:hAnsiTheme="majorBidi" w:cstheme="majorBidi"/>
+                <w:sz w:val="18"/>
+                <w:szCs w:val="18"/>
+                <w:rtl/>
+                <w:lang w:bidi="ar-IQ"/>
+              </w:rPr>
+              <w:t>{{</w:t>
+            </w:r>
+            <w:r>
+              <w:rPr>
+                <w:rFonts w:asciiTheme="majorBidi" w:hAnsiTheme="majorBidi" w:cstheme="majorBidi"/>
+                <w:sz w:val="18"/>
+                <w:szCs w:val="18"/>
+                <w:lang w:bidi="ar-IQ"/>
+              </w:rPr>
+              <w:t>row.left_subj</w:t>
+            </w:r>
             <w:r>
               <w:rPr>
                 <w:rFonts w:asciiTheme="majorBidi" w:hAnsiTheme="majorBidi" w:cstheme="majorBidi"/>
@@ -1936,7 +2110,6 @@
               </w:rPr>
               <w:t>{{</w:t>
             </w:r>
-            <w:proofErr w:type="spellStart"/>
             <w:r>
               <w:rPr>
                 <w:rFonts w:asciiTheme="majorBidi" w:hAnsiTheme="majorBidi" w:cstheme="majorBidi"/>
@@ -1944,107 +2117,8 @@
                 <w:szCs w:val="18"/>
                 <w:lang w:bidi="ar-IQ"/>
               </w:rPr>
-              <w:t>row.right_unit</w:t>
-            </w:r>
-            <w:proofErr w:type="spellEnd"/>
-            <w:r>
-              <w:rPr>
-                <w:rFonts w:asciiTheme="majorBidi" w:hAnsiTheme="majorBidi" w:cstheme="majorBidi"/>
-                <w:sz w:val="18"/>
-                <w:szCs w:val="18"/>
-                <w:rtl/>
-                <w:lang w:bidi="ar-IQ"/>
-              </w:rPr>
-              <w:t>}}</w:t>
-            </w:r>
-          </w:p>
-        </w:tc>
-        <w:tc>
-          <w:tcPr>
-            <w:tcW w:w="1831" w:type="pct"/>
-          </w:tcPr>
-          <w:p>
-            <w:pPr>
-              <w:keepNext/>
-              <w:keepLines/>
-              <w:spacing w:after="0"/>
-              <w:rPr>
-                <w:rFonts w:asciiTheme="majorBidi" w:hAnsiTheme="majorBidi" w:cstheme="majorBidi"/>
-                <w:sz w:val="18"/>
-                <w:szCs w:val="18"/>
-                <w:lang w:bidi="ar-IQ"/>
-              </w:rPr>
-            </w:pPr>
-            <w:r>
-              <w:rPr>
-                <w:rFonts w:asciiTheme="majorBidi" w:hAnsiTheme="majorBidi" w:cstheme="majorBidi"/>
-                <w:sz w:val="18"/>
-                <w:szCs w:val="18"/>
-                <w:rtl/>
-                <w:lang w:bidi="ar-IQ"/>
-              </w:rPr>
-              <w:t>{{</w:t>
-            </w:r>
-            <w:proofErr w:type="spellStart"/>
-            <w:r>
-              <w:rPr>
-                <w:rFonts w:asciiTheme="majorBidi" w:hAnsiTheme="majorBidi" w:cstheme="majorBidi"/>
-                <w:sz w:val="18"/>
-                <w:szCs w:val="18"/>
-                <w:lang w:bidi="ar-IQ"/>
-              </w:rPr>
-              <w:t>row.left_subj</w:t>
-            </w:r>
-            <w:proofErr w:type="spellEnd"/>
-            <w:r>
-              <w:rPr>
-                <w:rFonts w:asciiTheme="majorBidi" w:hAnsiTheme="majorBidi" w:cstheme="majorBidi"/>
-                <w:sz w:val="18"/>
-                <w:szCs w:val="18"/>
-                <w:rtl/>
-                <w:lang w:bidi="ar-IQ"/>
-              </w:rPr>
-              <w:t>}}</w:t>
-            </w:r>
-          </w:p>
-        </w:tc>
-        <w:tc>
-          <w:tcPr>
-            <w:tcW w:w="339" w:type="pct"/>
-          </w:tcPr>
-          <w:p>
-            <w:pPr>
-              <w:keepNext/>
-              <w:keepLines/>
-              <w:spacing w:after="0"/>
-              <w:rPr>
-                <w:rFonts w:asciiTheme="majorBidi" w:hAnsiTheme="majorBidi" w:cstheme="majorBidi"/>
-                <w:sz w:val="18"/>
-                <w:szCs w:val="18"/>
-                <w:lang w:bidi="ar-IQ"/>
-              </w:rPr>
-            </w:pPr>
-            <w:r>
-              <w:rPr>
-                <w:rFonts w:asciiTheme="majorBidi" w:hAnsiTheme="majorBidi" w:cstheme="majorBidi"/>
-                <w:sz w:val="18"/>
-                <w:szCs w:val="18"/>
-                <w:rtl/>
-                <w:lang w:bidi="ar-IQ"/>
-              </w:rPr>
-              <w:t>{{</w:t>
-            </w:r>
-            <w:proofErr w:type="spellStart"/>
-            <w:r>
-              <w:rPr>
-                <w:rFonts w:asciiTheme="majorBidi" w:hAnsiTheme="majorBidi" w:cstheme="majorBidi"/>
-                <w:sz w:val="18"/>
-                <w:szCs w:val="18"/>
-                <w:lang w:bidi="ar-IQ"/>
-              </w:rPr>
               <w:t>row.left_mark</w:t>
             </w:r>
-            <w:proofErr w:type="spellEnd"/>
             <w:r>
               <w:rPr>
                 <w:rFonts w:asciiTheme="majorBidi" w:hAnsiTheme="majorBidi" w:cstheme="majorBidi"/>
@@ -2082,7 +2156,6 @@
               </w:rPr>
               <w:t>{{</w:t>
             </w:r>
-            <w:proofErr w:type="spellStart"/>
             <w:r>
               <w:rPr>
                 <w:rFonts w:asciiTheme="majorBidi" w:hAnsiTheme="majorBidi" w:cstheme="majorBidi"/>
@@ -2092,7 +2165,6 @@
               </w:rPr>
               <w:t>row.left_unit</w:t>
             </w:r>
-            <w:proofErr w:type="spellEnd"/>
             <w:r>
               <w:rPr>
                 <w:rFonts w:asciiTheme="majorBidi" w:hAnsiTheme="majorBidi" w:cstheme="majorBidi"/>
@@ -2113,7 +2185,7 @@
         <w:tc>
           <w:tcPr>
             <w:tcW w:w="5000" w:type="pct"/>
-            <w:gridSpan w:val="6"/>
+            <w:gridSpan w:val="7"/>
           </w:tcPr>
           <w:p>
             <w:pPr>
@@ -2144,20 +2216,35 @@
                 <w:szCs w:val="18"/>
                 <w:lang w:bidi="ar-IQ"/>
               </w:rPr>
-              <w:t xml:space="preserve">tr </w:t>
-            </w:r>
-            <w:proofErr w:type="spellStart"/>
+              <w:t>tr endfor</w:t>
+            </w:r>
             <w:r>
               <w:rPr>
                 <w:rFonts w:asciiTheme="majorBidi" w:hAnsiTheme="majorBidi" w:cstheme="majorBidi"/>
                 <w:sz w:val="18"/>
                 <w:szCs w:val="18"/>
-                <w:lang w:bidi="ar-IQ"/>
-              </w:rPr>
-              <w:t>endfor</w:t>
-            </w:r>
-            <w:proofErr w:type="spellEnd"/>
-            <w:r>
+                <w:rtl/>
+                <w:lang w:bidi="ar-IQ"/>
+              </w:rPr>
+              <w:t xml:space="preserve"> %}</w:t>
+            </w:r>
+          </w:p>
+        </w:tc>
+      </w:tr>
+      <w:tr>
+        <w:trPr>
+          <w:cantSplit/>
+        </w:trPr>
+        <w:tc>
+          <w:tcPr>
+            <w:tcW w:w="2500" w:type="pct"/>
+            <w:gridSpan w:val="3"/>
+          </w:tcPr>
+          <w:p>
+            <w:pPr>
+              <w:keepNext/>
+              <w:keepLines/>
+              <w:spacing w:after="0"/>
               <w:rPr>
                 <w:rFonts w:asciiTheme="majorBidi" w:hAnsiTheme="majorBidi" w:cstheme="majorBidi"/>
                 <w:sz w:val="18"/>
@@ -2165,7 +2252,104 @@
                 <w:rtl/>
                 <w:lang w:bidi="ar-IQ"/>
               </w:rPr>
-              <w:t xml:space="preserve"> %}</w:t>
+            </w:pPr>
+            <w:r>
+              <w:rPr>
+                <w:rFonts w:asciiTheme="minorBidi" w:hAnsiTheme="minorBidi" w:cstheme="minorBidi" w:hint="cs"/>
+                <w:sz w:val="20"/>
+                <w:szCs w:val="20"/>
+                <w:rtl/>
+                <w:lang w:bidi="ar-IQ"/>
+              </w:rPr>
+              <w:t xml:space="preserve">ناجح بالدور: </w:t>
+            </w:r>
+            <w:r>
+              <w:rPr>
+                <w:rFonts w:asciiTheme="minorBidi" w:hAnsiTheme="minorBidi" w:cstheme="minorBidi"/>
+                <w:sz w:val="20"/>
+                <w:szCs w:val="20"/>
+                <w:rtl/>
+                <w:lang w:bidi="ar-IQ"/>
+              </w:rPr>
+              <w:t>{{</w:t>
+            </w:r>
+            <w:r>
+              <w:rPr>
+                <w:rFonts w:asciiTheme="minorBidi" w:hAnsiTheme="minorBidi" w:cstheme="minorBidi"/>
+                <w:sz w:val="20"/>
+                <w:szCs w:val="20"/>
+                <w:lang w:bidi="ar-IQ"/>
+              </w:rPr>
+              <w:t>attempt</w:t>
+            </w:r>
+            <w:r>
+              <w:rPr>
+                <w:rFonts w:asciiTheme="minorBidi" w:hAnsiTheme="minorBidi" w:cstheme="minorBidi"/>
+                <w:sz w:val="20"/>
+                <w:szCs w:val="20"/>
+                <w:rtl/>
+                <w:lang w:bidi="ar-IQ"/>
+              </w:rPr>
+              <w:t>}}</w:t>
+            </w:r>
+          </w:p>
+        </w:tc>
+        <w:tc>
+          <w:tcPr>
+            <w:tcW w:w="2500" w:type="pct"/>
+            <w:gridSpan w:val="4"/>
+          </w:tcPr>
+          <w:p>
+            <w:pPr>
+              <w:keepNext/>
+              <w:keepLines/>
+              <w:spacing w:after="0"/>
+              <w:rPr>
+                <w:rFonts w:asciiTheme="majorBidi" w:hAnsiTheme="majorBidi" w:cstheme="majorBidi"/>
+                <w:sz w:val="18"/>
+                <w:szCs w:val="18"/>
+                <w:rtl/>
+                <w:lang w:bidi="ar-IQ"/>
+              </w:rPr>
+            </w:pPr>
+            <w:r>
+              <w:rPr>
+                <w:rFonts w:asciiTheme="majorBidi" w:hAnsiTheme="majorBidi" w:cstheme="majorBidi" w:hint="cs"/>
+                <w:sz w:val="20"/>
+                <w:szCs w:val="20"/>
+                <w:rtl/>
+                <w:lang w:bidi="ar-IQ"/>
+              </w:rPr>
+              <w:t>ناجح بالدور:</w:t>
+            </w:r>
+            <w:r>
+              <w:rPr>
+                <w:rFonts w:asciiTheme="minorBidi" w:hAnsiTheme="minorBidi" w:cstheme="minorBidi"/>
+                <w:sz w:val="20"/>
+                <w:szCs w:val="20"/>
+                <w:rtl/>
+                <w:lang w:bidi="ar-IQ"/>
+              </w:rPr>
+              <w:t xml:space="preserve"> {{</w:t>
+            </w:r>
+            <w:r>
+              <w:rPr>
+                <w:rFonts w:asciiTheme="minorBidi" w:hAnsiTheme="minorBidi" w:cstheme="minorBidi"/>
+                <w:sz w:val="20"/>
+                <w:szCs w:val="20"/>
+                <w:lang w:bidi="ar-IQ"/>
+              </w:rPr>
+              <w:t>attempt</w:t>
+            </w:r>
+            <w:r>
+              <w:rPr>
+                <w:rFonts w:asciiTheme="minorBidi" w:hAnsiTheme="minorBidi" w:cstheme="minorBidi"/>
+                <w:sz w:val="20"/>
+                <w:szCs w:val="20"/>
+                <w:rtl/>
+                <w:lang w:bidi="ar-IQ"/>
+              </w:rPr>
+              <w:t>}}</w:t>
             </w:r>
           </w:p>
         </w:tc>
@@ -2189,7 +2373,6 @@
         </w:rPr>
         <w:t xml:space="preserve">{% </w:t>
       </w:r>
-      <w:proofErr w:type="spellStart"/>
       <w:r>
         <w:rPr>
           <w:rFonts w:asciiTheme="majorBidi" w:hAnsiTheme="majorBidi" w:cstheme="majorBidi"/>
@@ -2197,7 +2380,6 @@
         </w:rPr>
         <w:t>endfor</w:t>
       </w:r>
-      <w:proofErr w:type="spellEnd"/>
       <w:r>
         <w:rPr>
           <w:rFonts w:asciiTheme="majorBidi" w:hAnsiTheme="majorBidi" w:cstheme="majorBidi"/>
@@ -2672,7 +2854,6 @@
         <w:lastRenderedPageBreak/>
         <w:t>{{</w:t>
       </w:r>
-      <w:proofErr w:type="spellStart"/>
       <w:r>
         <w:rPr>
           <w:rFonts w:asciiTheme="majorBidi" w:hAnsiTheme="majorBidi" w:cstheme="majorBidi"/>
@@ -2680,7 +2861,6 @@
         </w:rPr>
         <w:t>Back_page</w:t>
       </w:r>
-      <w:proofErr w:type="spellEnd"/>
       <w:r>
         <w:rPr>
           <w:rFonts w:asciiTheme="majorBidi" w:hAnsiTheme="majorBidi" w:cstheme="majorBidi"/>
@@ -2881,47 +3061,11 @@
       <w:pPr>
         <w:rPr>
           <w:rFonts w:asciiTheme="majorBidi" w:hAnsiTheme="majorBidi" w:cstheme="majorBidi"/>
-          <w:lang w:bidi="ar-IQ"/>
-        </w:rPr>
-      </w:pPr>
-      <w:r>
-        <w:rPr>
-          <w:rFonts w:asciiTheme="majorBidi" w:hAnsiTheme="majorBidi" w:cstheme="majorBidi"/>
-          <w:sz w:val="24"/>
-          <w:szCs w:val="24"/>
-          <w:rtl/>
-          <w:lang w:bidi="ar-IQ"/>
-        </w:rPr>
-        <w:t>{%</w:t>
-      </w:r>
-      <w:r>
-        <w:rPr>
-          <w:rFonts w:asciiTheme="majorBidi" w:hAnsiTheme="majorBidi" w:cstheme="majorBidi"/>
-          <w:sz w:val="24"/>
-          <w:szCs w:val="24"/>
-          <w:lang w:bidi="ar-IQ"/>
-        </w:rPr>
-        <w:t xml:space="preserve">p if </w:t>
-      </w:r>
-      <w:proofErr w:type="spellStart"/>
-      <w:r>
-        <w:rPr>
-          <w:rFonts w:asciiTheme="majorBidi" w:hAnsiTheme="majorBidi" w:cstheme="majorBidi"/>
-          <w:lang w:bidi="ar-IQ"/>
-        </w:rPr>
-        <w:t>Summer_ON</w:t>
-      </w:r>
-      <w:proofErr w:type="spellEnd"/>
-      <w:r>
-        <w:rPr>
-          <w:rFonts w:asciiTheme="majorBidi" w:hAnsiTheme="majorBidi" w:cstheme="majorBidi"/>
-          <w:sz w:val="24"/>
-          <w:szCs w:val="24"/>
-          <w:rtl/>
-          <w:lang w:bidi="ar-IQ"/>
-        </w:rPr>
-        <w:t xml:space="preserve"> %}</w:t>
-      </w:r>
+          <w:sz w:val="24"/>
+          <w:szCs w:val="24"/>
+          <w:lang w:bidi="ar-IQ"/>
+        </w:rPr>
+      </w:pPr>
     </w:p>
     <w:p>
       <w:pPr>
@@ -2944,7 +3088,26 @@
           <w:szCs w:val="24"/>
           <w:rtl/>
         </w:rPr>
-        <w:t xml:space="preserve">التدريب الصيفي: أكمل الطالب متطلبات التدريب الصيفي خلال العام الدراسي </w:t>
+        <w:t>ال</w:t>
+      </w:r>
+      <w:r>
+        <w:rPr>
+          <w:rFonts w:asciiTheme="majorBidi" w:hAnsiTheme="majorBidi" w:cstheme="majorBidi" w:hint="cs"/>
+          <w:sz w:val="24"/>
+          <w:szCs w:val="24"/>
+          <w:rtl/>
+          <w:lang w:bidi="ar-IQ"/>
+        </w:rPr>
+        <w:t>أمر</w:t>
+      </w:r>
+      <w:r>
+        <w:rPr>
+          <w:rFonts w:asciiTheme="majorBidi" w:hAnsiTheme="majorBidi" w:cstheme="majorBidi"/>
+          <w:sz w:val="24"/>
+          <w:szCs w:val="24"/>
+          <w:rtl/>
+        </w:rPr>
+        <w:t xml:space="preserve"> الجامعي : </w:t>
       </w:r>
       <w:r>
         <w:rPr>
@@ -2956,17 +3119,15 @@
         </w:rPr>
         <w:t>{{</w:t>
       </w:r>
-      <w:proofErr w:type="spellStart"/>
-      <w:r>
-        <w:rPr>
-          <w:rFonts w:asciiTheme="majorBidi" w:hAnsiTheme="majorBidi" w:cstheme="majorBidi"/>
-          <w:sz w:val="24"/>
-          <w:szCs w:val="24"/>
-          <w:lang w:bidi="ar-IQ"/>
-        </w:rPr>
-        <w:t>Summer_Training_year</w:t>
-      </w:r>
-      <w:proofErr w:type="spellEnd"/>
+      <w:r>
+        <w:rPr>
+          <w:rFonts w:asciiTheme="majorBidi" w:hAnsiTheme="majorBidi" w:cstheme="majorBidi"/>
+          <w:sz w:val="24"/>
+          <w:szCs w:val="24"/>
+          <w:lang w:bidi="ar-IQ"/>
+        </w:rPr>
+        <w:t>order_number</w:t>
+      </w:r>
       <w:r>
         <w:rPr>
           <w:rFonts w:asciiTheme="majorBidi" w:hAnsiTheme="majorBidi" w:cstheme="majorBidi"/>
@@ -2979,20 +3140,66 @@
       </w:r>
       <w:r>
         <w:rPr>
-          <w:rFonts w:asciiTheme="majorBidi" w:hAnsiTheme="majorBidi" w:cstheme="majorBidi" w:hint="cs"/>
-          <w:sz w:val="24"/>
-          <w:szCs w:val="24"/>
-          <w:rtl/>
-        </w:rPr>
-        <w:t>.</w:t>
+          <w:rFonts w:asciiTheme="majorBidi" w:hAnsiTheme="majorBidi" w:cstheme="majorBidi"/>
+          <w:sz w:val="24"/>
+          <w:szCs w:val="24"/>
+          <w:rtl/>
+        </w:rPr>
+        <w:t xml:space="preserve"> </w:t>
+      </w:r>
+      <w:r>
+        <w:rPr>
+          <w:rFonts w:asciiTheme="majorBidi" w:hAnsiTheme="majorBidi" w:cstheme="majorBidi"/>
+          <w:sz w:val="24"/>
+          <w:szCs w:val="24"/>
+          <w:rtl/>
+          <w:lang w:bidi="ar-IQ"/>
+        </w:rPr>
+        <w:t xml:space="preserve"> </w:t>
+      </w:r>
+      <w:r>
+        <w:rPr>
+          <w:rFonts w:asciiTheme="majorBidi" w:hAnsiTheme="majorBidi" w:cstheme="majorBidi"/>
+          <w:sz w:val="24"/>
+          <w:szCs w:val="24"/>
+          <w:rtl/>
+        </w:rPr>
+        <w:t xml:space="preserve">في </w:t>
+      </w:r>
+      <w:r>
+        <w:rPr>
+          <w:rFonts w:asciiTheme="majorBidi" w:hAnsiTheme="majorBidi" w:cstheme="majorBidi"/>
+          <w:sz w:val="24"/>
+          <w:szCs w:val="24"/>
+          <w:rtl/>
+          <w:lang w:bidi="ar-IQ"/>
+        </w:rPr>
+        <w:t xml:space="preserve"> {{</w:t>
+      </w:r>
+      <w:r>
+        <w:rPr>
+          <w:rFonts w:asciiTheme="majorBidi" w:hAnsiTheme="majorBidi" w:cstheme="majorBidi"/>
+          <w:sz w:val="24"/>
+          <w:szCs w:val="24"/>
+          <w:lang w:bidi="ar-IQ"/>
+        </w:rPr>
+        <w:t>order_date</w:t>
+      </w:r>
+      <w:r>
+        <w:rPr>
+          <w:rFonts w:asciiTheme="majorBidi" w:hAnsiTheme="majorBidi" w:cstheme="majorBidi"/>
+          <w:sz w:val="24"/>
+          <w:szCs w:val="24"/>
+          <w:rtl/>
+          <w:lang w:bidi="ar-IQ"/>
+        </w:rPr>
+        <w:t>}}</w:t>
       </w:r>
     </w:p>
     <w:p>
       <w:pPr>
         <w:rPr>
           <w:rFonts w:asciiTheme="majorBidi" w:hAnsiTheme="majorBidi" w:cstheme="majorBidi"/>
-          <w:sz w:val="24"/>
-          <w:szCs w:val="24"/>
           <w:lang w:bidi="ar-IQ"/>
         </w:rPr>
       </w:pPr>
@@ -3013,7 +3220,14 @@
           <w:szCs w:val="24"/>
           <w:lang w:bidi="ar-IQ"/>
         </w:rPr>
-        <w:t>p endif</w:t>
+        <w:t xml:space="preserve">p if </w:t>
+      </w:r>
+      <w:r>
+        <w:rPr>
+          <w:rFonts w:asciiTheme="majorBidi" w:hAnsiTheme="majorBidi" w:cstheme="majorBidi"/>
+          <w:lang w:bidi="ar-IQ"/>
+        </w:rPr>
+        <w:t>Summer_ON</w:t>
       </w:r>
       <w:r>
         <w:rPr>
@@ -3037,18 +3251,46 @@
           <w:rFonts w:asciiTheme="majorBidi" w:hAnsiTheme="majorBidi" w:cstheme="majorBidi"/>
           <w:sz w:val="24"/>
           <w:szCs w:val="24"/>
-          <w:rtl/>
-          <w:lang w:bidi="ar-IQ"/>
-        </w:rPr>
-      </w:pPr>
-      <w:r>
-        <w:rPr>
-          <w:rFonts w:asciiTheme="majorBidi" w:hAnsiTheme="majorBidi" w:cstheme="majorBidi"/>
-          <w:sz w:val="24"/>
-          <w:szCs w:val="24"/>
-          <w:rtl/>
-        </w:rPr>
-        <w:t>ال</w:t>
+          <w:lang w:bidi="ar-IQ"/>
+        </w:rPr>
+      </w:pPr>
+      <w:r>
+        <w:rPr>
+          <w:rFonts w:asciiTheme="majorBidi" w:hAnsiTheme="majorBidi" w:cstheme="majorBidi"/>
+          <w:sz w:val="24"/>
+          <w:szCs w:val="24"/>
+          <w:rtl/>
+        </w:rPr>
+        <w:t xml:space="preserve">التدريب الصيفي: أكمل الطالب متطلبات التدريب الصيفي خلال العام الدراسي </w:t>
+      </w:r>
+      <w:r>
+        <w:rPr>
+          <w:rFonts w:asciiTheme="majorBidi" w:hAnsiTheme="majorBidi" w:cstheme="majorBidi"/>
+          <w:sz w:val="24"/>
+          <w:szCs w:val="24"/>
+          <w:rtl/>
+          <w:lang w:bidi="ar-IQ"/>
+        </w:rPr>
+        <w:t>{{</w:t>
+      </w:r>
+      <w:r>
+        <w:rPr>
+          <w:rFonts w:asciiTheme="majorBidi" w:hAnsiTheme="majorBidi" w:cstheme="majorBidi"/>
+          <w:sz w:val="24"/>
+          <w:szCs w:val="24"/>
+          <w:lang w:bidi="ar-IQ"/>
+        </w:rPr>
+        <w:t>Summer_Training_year</w:t>
+      </w:r>
+      <w:r>
+        <w:rPr>
+          <w:rFonts w:asciiTheme="majorBidi" w:hAnsiTheme="majorBidi" w:cstheme="majorBidi"/>
+          <w:sz w:val="24"/>
+          <w:szCs w:val="24"/>
+          <w:rtl/>
+          <w:lang w:bidi="ar-IQ"/>
+        </w:rPr>
+        <w:t>}}</w:t>
       </w:r>
       <w:r>
         <w:rPr>
@@ -3056,108 +3298,47 @@
           <w:sz w:val="24"/>
           <w:szCs w:val="24"/>
           <w:rtl/>
-          <w:lang w:bidi="ar-IQ"/>
-        </w:rPr>
-        <w:t>أمر</w:t>
-      </w:r>
-      <w:r>
-        <w:rPr>
-          <w:rFonts w:asciiTheme="majorBidi" w:hAnsiTheme="majorBidi" w:cstheme="majorBidi"/>
-          <w:sz w:val="24"/>
-          <w:szCs w:val="24"/>
-          <w:rtl/>
-        </w:rPr>
-        <w:t xml:space="preserve"> الجامعي : </w:t>
-      </w:r>
-      <w:r>
-        <w:rPr>
-          <w:rFonts w:asciiTheme="majorBidi" w:hAnsiTheme="majorBidi" w:cstheme="majorBidi"/>
-          <w:sz w:val="24"/>
-          <w:szCs w:val="24"/>
-          <w:rtl/>
-          <w:lang w:bidi="ar-IQ"/>
-        </w:rPr>
-        <w:t>{{</w:t>
-      </w:r>
-      <w:proofErr w:type="spellStart"/>
-      <w:r>
-        <w:rPr>
-          <w:rFonts w:asciiTheme="majorBidi" w:hAnsiTheme="majorBidi" w:cstheme="majorBidi"/>
-          <w:sz w:val="24"/>
-          <w:szCs w:val="24"/>
-          <w:lang w:bidi="ar-IQ"/>
-        </w:rPr>
-        <w:t>order_number</w:t>
-      </w:r>
-      <w:proofErr w:type="spellEnd"/>
-      <w:r>
-        <w:rPr>
-          <w:rFonts w:asciiTheme="majorBidi" w:hAnsiTheme="majorBidi" w:cstheme="majorBidi"/>
-          <w:sz w:val="24"/>
-          <w:szCs w:val="24"/>
-          <w:rtl/>
-          <w:lang w:bidi="ar-IQ"/>
-        </w:rPr>
-        <w:t>}}</w:t>
-      </w:r>
-      <w:r>
-        <w:rPr>
-          <w:rFonts w:asciiTheme="majorBidi" w:hAnsiTheme="majorBidi" w:cstheme="majorBidi"/>
-          <w:sz w:val="24"/>
-          <w:szCs w:val="24"/>
-          <w:rtl/>
-        </w:rPr>
-        <w:t xml:space="preserve"> </w:t>
-      </w:r>
-      <w:r>
-        <w:rPr>
-          <w:rFonts w:asciiTheme="majorBidi" w:hAnsiTheme="majorBidi" w:cstheme="majorBidi"/>
-          <w:sz w:val="24"/>
-          <w:szCs w:val="24"/>
-          <w:rtl/>
-          <w:lang w:bidi="ar-IQ"/>
-        </w:rPr>
-        <w:t xml:space="preserve"> </w:t>
-      </w:r>
-      <w:r>
-        <w:rPr>
-          <w:rFonts w:asciiTheme="majorBidi" w:hAnsiTheme="majorBidi" w:cstheme="majorBidi"/>
-          <w:sz w:val="24"/>
-          <w:szCs w:val="24"/>
-          <w:rtl/>
-        </w:rPr>
-        <w:t xml:space="preserve">في </w:t>
-      </w:r>
-      <w:r>
-        <w:rPr>
-          <w:rFonts w:asciiTheme="majorBidi" w:hAnsiTheme="majorBidi" w:cstheme="majorBidi"/>
-          <w:sz w:val="24"/>
-          <w:szCs w:val="24"/>
-          <w:rtl/>
-          <w:lang w:bidi="ar-IQ"/>
-        </w:rPr>
-        <w:t xml:space="preserve"> {{</w:t>
-      </w:r>
-      <w:proofErr w:type="spellStart"/>
-      <w:r>
-        <w:rPr>
-          <w:rFonts w:asciiTheme="majorBidi" w:hAnsiTheme="majorBidi" w:cstheme="majorBidi"/>
-          <w:sz w:val="24"/>
-          <w:szCs w:val="24"/>
-          <w:lang w:bidi="ar-IQ"/>
-        </w:rPr>
-        <w:t>order_date</w:t>
-      </w:r>
-      <w:proofErr w:type="spellEnd"/>
-      <w:r>
-        <w:rPr>
-          <w:rFonts w:asciiTheme="majorBidi" w:hAnsiTheme="majorBidi" w:cstheme="majorBidi"/>
-          <w:sz w:val="24"/>
-          <w:szCs w:val="24"/>
-          <w:rtl/>
-          <w:lang w:bidi="ar-IQ"/>
-        </w:rPr>
-        <w:t>}}</w:t>
+        </w:rPr>
+        <w:t>.</w:t>
+      </w:r>
+    </w:p>
+    <w:p>
+      <w:pPr>
+        <w:rPr>
+          <w:rFonts w:asciiTheme="majorBidi" w:hAnsiTheme="majorBidi" w:cstheme="majorBidi"/>
+          <w:sz w:val="24"/>
+          <w:szCs w:val="24"/>
+          <w:lang w:bidi="ar-IQ"/>
+        </w:rPr>
+      </w:pPr>
+      <w:r>
+        <w:rPr>
+          <w:rFonts w:asciiTheme="majorBidi" w:hAnsiTheme="majorBidi" w:cstheme="majorBidi"/>
+          <w:sz w:val="24"/>
+          <w:szCs w:val="24"/>
+          <w:rtl/>
+          <w:lang w:bidi="ar-IQ"/>
+        </w:rPr>
+        <w:t>{%</w:t>
+      </w:r>
+      <w:r>
+        <w:rPr>
+          <w:rFonts w:asciiTheme="majorBidi" w:hAnsiTheme="majorBidi" w:cstheme="majorBidi"/>
+          <w:sz w:val="24"/>
+          <w:szCs w:val="24"/>
+          <w:lang w:bidi="ar-IQ"/>
+        </w:rPr>
+        <w:t>p endif</w:t>
+      </w:r>
+      <w:r>
+        <w:rPr>
+          <w:rFonts w:asciiTheme="majorBidi" w:hAnsiTheme="majorBidi" w:cstheme="majorBidi"/>
+          <w:sz w:val="24"/>
+          <w:szCs w:val="24"/>
+          <w:rtl/>
+          <w:lang w:bidi="ar-IQ"/>
+        </w:rPr>
+        <w:t xml:space="preserve"> %}</w:t>
       </w:r>
     </w:p>
     <w:p>
@@ -3181,7 +3362,26 @@
           <w:szCs w:val="24"/>
           <w:rtl/>
         </w:rPr>
-        <w:t xml:space="preserve">التقدير: </w:t>
+        <w:t>التقدير</w:t>
+      </w:r>
+      <w:r>
+        <w:rPr>
+          <w:rFonts w:asciiTheme="majorBidi" w:hAnsiTheme="majorBidi" w:cstheme="majorBidi" w:hint="cs"/>
+          <w:sz w:val="24"/>
+          <w:szCs w:val="24"/>
+          <w:rtl/>
+          <w:lang w:bidi="ar-IQ"/>
+        </w:rPr>
+        <w:t>ات</w:t>
+      </w:r>
+      <w:r>
+        <w:rPr>
+          <w:rFonts w:asciiTheme="majorBidi" w:hAnsiTheme="majorBidi" w:cstheme="majorBidi"/>
+          <w:sz w:val="24"/>
+          <w:szCs w:val="24"/>
+          <w:rtl/>
+        </w:rPr>
+        <w:t xml:space="preserve">: </w:t>
       </w:r>
       <w:r>
         <w:rPr>
@@ -3201,7 +3401,25 @@
           <w:rtl/>
         </w:rPr>
         <w:tab/>
-        <w:t>(50 - أقل من 60)</w:t>
+        <w:t>(</w:t>
+      </w:r>
+      <w:r>
+        <w:rPr>
+          <w:rFonts w:asciiTheme="majorBidi" w:hAnsiTheme="majorBidi" w:cstheme="majorBidi" w:hint="cs"/>
+          <w:sz w:val="24"/>
+          <w:szCs w:val="24"/>
+          <w:rtl/>
+        </w:rPr>
+        <w:t>50</w:t>
+      </w:r>
+      <w:r>
+        <w:rPr>
+          <w:rFonts w:asciiTheme="majorBidi" w:hAnsiTheme="majorBidi" w:cstheme="majorBidi"/>
+          <w:sz w:val="24"/>
+          <w:szCs w:val="24"/>
+          <w:rtl/>
+        </w:rPr>
+        <w:t xml:space="preserve"> - أقل من 60)</w:t>
       </w:r>
     </w:p>
     <w:p>
@@ -3364,19 +3582,8 @@
           <w:szCs w:val="24"/>
           <w:lang w:bidi="ar-IQ"/>
         </w:rPr>
-        <w:t xml:space="preserve">p if </w:t>
-      </w:r>
-      <w:proofErr w:type="spellStart"/>
-      <w:r>
-        <w:rPr>
-          <w:rFonts w:asciiTheme="majorBidi" w:hAnsiTheme="majorBidi" w:cstheme="majorBidi"/>
-          <w:sz w:val="24"/>
-          <w:szCs w:val="24"/>
-          <w:lang w:bidi="ar-IQ"/>
-        </w:rPr>
-        <w:t>Failure_ON</w:t>
-      </w:r>
-      <w:proofErr w:type="spellEnd"/>
+        <w:t>p if Failure_ON</w:t>
+      </w:r>
       <w:r>
         <w:rPr>
           <w:rFonts w:asciiTheme="majorBidi" w:hAnsiTheme="majorBidi" w:cstheme="majorBidi"/>
@@ -3411,164 +3618,64 @@
         </w:rPr>
         <w:t xml:space="preserve">سنوات التأجيل والرسوب: </w:t>
       </w:r>
-      <w:r>
-        <w:rPr>
-          <w:rFonts w:asciiTheme="majorBidi" w:hAnsiTheme="majorBidi" w:cstheme="majorBidi"/>
-          <w:sz w:val="24"/>
-          <w:szCs w:val="24"/>
-          <w:rtl/>
-          <w:lang w:bidi="ar-IQ"/>
-        </w:rPr>
-        <w:t>{{</w:t>
-      </w:r>
-      <w:proofErr w:type="spellStart"/>
-      <w:r>
-        <w:rPr>
-          <w:rFonts w:asciiTheme="majorBidi" w:hAnsiTheme="majorBidi" w:cstheme="majorBidi"/>
-          <w:sz w:val="24"/>
-          <w:szCs w:val="24"/>
-          <w:lang w:bidi="ar-IQ"/>
-        </w:rPr>
-        <w:t>Postponement_and_Failure_Years</w:t>
-      </w:r>
-      <w:proofErr w:type="spellEnd"/>
-      <w:r>
-        <w:rPr>
-          <w:rFonts w:asciiTheme="majorBidi" w:hAnsiTheme="majorBidi" w:cstheme="majorBidi"/>
-          <w:sz w:val="24"/>
-          <w:szCs w:val="24"/>
-          <w:rtl/>
-          <w:lang w:bidi="ar-IQ"/>
-        </w:rPr>
-        <w:t xml:space="preserve"> }}</w:t>
-      </w:r>
-      <w:r>
-        <w:rPr>
-          <w:rFonts w:asciiTheme="majorBidi" w:hAnsiTheme="majorBidi" w:cstheme="majorBidi"/>
-          <w:sz w:val="24"/>
-          <w:szCs w:val="24"/>
-          <w:rtl/>
-        </w:rPr>
-        <w:t>.</w:t>
-      </w:r>
     </w:p>
     <w:p>
       <w:pPr>
         <w:rPr>
           <w:rFonts w:asciiTheme="majorBidi" w:hAnsiTheme="majorBidi" w:cstheme="majorBidi"/>
-          <w:sz w:val="24"/>
-          <w:szCs w:val="24"/>
-          <w:rtl/>
-          <w:lang w:bidi="ar-IQ"/>
-        </w:rPr>
-      </w:pPr>
-      <w:r>
-        <w:rPr>
-          <w:rFonts w:asciiTheme="majorBidi" w:hAnsiTheme="majorBidi" w:cstheme="majorBidi"/>
-          <w:sz w:val="24"/>
-          <w:szCs w:val="24"/>
-          <w:rtl/>
-          <w:lang w:bidi="ar-IQ"/>
-        </w:rPr>
-        <w:t>{%</w:t>
-      </w:r>
-      <w:r>
-        <w:rPr>
-          <w:rFonts w:asciiTheme="majorBidi" w:hAnsiTheme="majorBidi" w:cstheme="majorBidi"/>
-          <w:sz w:val="24"/>
-          <w:szCs w:val="24"/>
-          <w:lang w:bidi="ar-IQ"/>
-        </w:rPr>
-        <w:t xml:space="preserve">p </w:t>
-      </w:r>
-      <w:r>
-        <w:rPr>
-          <w:rFonts w:asciiTheme="majorBidi" w:hAnsiTheme="majorBidi" w:cstheme="majorBidi"/>
-          <w:sz w:val="24"/>
-          <w:szCs w:val="24"/>
-          <w:lang w:bidi="ar-IQ"/>
-        </w:rPr>
-        <w:t>endif</w:t>
-      </w:r>
-      <w:r>
-        <w:rPr>
-          <w:rFonts w:asciiTheme="majorBidi" w:hAnsiTheme="majorBidi" w:cstheme="majorBidi"/>
-          <w:sz w:val="24"/>
-          <w:szCs w:val="24"/>
+          <w:lang w:bidi="ar-IQ"/>
+        </w:rPr>
+      </w:pPr>
+      <w:r>
+        <w:rPr>
+          <w:rFonts w:asciiTheme="majorBidi" w:hAnsiTheme="majorBidi" w:cstheme="majorBidi"/>
+          <w:rtl/>
+          <w:lang w:bidi="ar-IQ"/>
+        </w:rPr>
+        <w:t xml:space="preserve">{% </w:t>
+      </w:r>
+      <w:r>
+        <w:rPr>
+          <w:rFonts w:asciiTheme="majorBidi" w:hAnsiTheme="majorBidi" w:cstheme="majorBidi"/>
+          <w:lang w:bidi="ar-IQ"/>
+        </w:rPr>
+        <w:t xml:space="preserve">for </w:t>
+      </w:r>
+      <w:r>
+        <w:rPr>
+          <w:rFonts w:asciiTheme="majorBidi" w:hAnsiTheme="majorBidi" w:cstheme="majorBidi"/>
+          <w:lang w:bidi="ar-IQ"/>
+        </w:rPr>
+        <w:t>year</w:t>
+      </w:r>
+      <w:r>
+        <w:rPr>
+          <w:rFonts w:asciiTheme="majorBidi" w:hAnsiTheme="majorBidi" w:cstheme="majorBidi"/>
+          <w:lang w:bidi="ar-IQ"/>
+        </w:rPr>
+        <w:t xml:space="preserve"> </w:t>
+      </w:r>
+      <w:r>
+        <w:rPr>
+          <w:rFonts w:asciiTheme="majorBidi" w:hAnsiTheme="majorBidi" w:cstheme="majorBidi"/>
+          <w:lang w:bidi="ar-IQ"/>
+        </w:rPr>
+        <w:t>in failed</w:t>
+      </w:r>
+      <w:r>
+        <w:rPr>
+          <w:rFonts w:asciiTheme="majorBidi" w:hAnsiTheme="majorBidi" w:cstheme="majorBidi"/>
+          <w:lang w:bidi="ar-IQ"/>
+        </w:rPr>
+        <w:t>_years</w:t>
+      </w:r>
+      <w:r>
+        <w:rPr>
+          <w:rFonts w:asciiTheme="majorBidi" w:hAnsiTheme="majorBidi" w:cstheme="majorBidi"/>
           <w:rtl/>
           <w:lang w:bidi="ar-IQ"/>
         </w:rPr>
         <w:t xml:space="preserve"> %}</w:t>
-      </w:r>
-    </w:p>
-    <w:p>
-      <w:pPr>
-        <w:rPr>
-          <w:rFonts w:asciiTheme="majorBidi" w:hAnsiTheme="majorBidi" w:cstheme="majorBidi"/>
-          <w:sz w:val="24"/>
-          <w:szCs w:val="24"/>
-          <w:rtl/>
-          <w:lang w:bidi="ar-IQ"/>
-        </w:rPr>
-      </w:pPr>
-      <w:r>
-        <w:rPr>
-          <w:rFonts w:asciiTheme="majorBidi" w:hAnsiTheme="majorBidi" w:cstheme="majorBidi"/>
-          <w:sz w:val="24"/>
-          <w:szCs w:val="24"/>
-          <w:rtl/>
-          <w:lang w:bidi="ar-IQ"/>
-        </w:rPr>
-        <w:t>{%</w:t>
-      </w:r>
-      <w:r>
-        <w:rPr>
-          <w:rFonts w:asciiTheme="majorBidi" w:hAnsiTheme="majorBidi" w:cstheme="majorBidi"/>
-          <w:sz w:val="24"/>
-          <w:szCs w:val="24"/>
-          <w:lang w:bidi="ar-IQ"/>
-        </w:rPr>
-        <w:t>p</w:t>
-      </w:r>
-      <w:r>
-        <w:rPr>
-          <w:rFonts w:asciiTheme="majorBidi" w:hAnsiTheme="majorBidi" w:cstheme="majorBidi"/>
-          <w:sz w:val="24"/>
-          <w:szCs w:val="24"/>
-          <w:lang w:bidi="ar-IQ"/>
-        </w:rPr>
-        <w:t xml:space="preserve"> if </w:t>
-      </w:r>
-      <w:proofErr w:type="spellStart"/>
-      <w:r>
-        <w:rPr>
-          <w:rFonts w:asciiTheme="majorBidi" w:hAnsiTheme="majorBidi" w:cstheme="majorBidi"/>
-          <w:sz w:val="24"/>
-          <w:szCs w:val="24"/>
-          <w:lang w:bidi="ar-IQ"/>
-        </w:rPr>
-        <w:t>Passed_ON</w:t>
-      </w:r>
-      <w:proofErr w:type="spellEnd"/>
-      <w:r>
-        <w:rPr>
-          <w:rFonts w:asciiTheme="majorBidi" w:hAnsiTheme="majorBidi" w:cstheme="majorBidi"/>
-          <w:sz w:val="24"/>
-          <w:szCs w:val="24"/>
-          <w:rtl/>
-          <w:lang w:bidi="ar-IQ"/>
-        </w:rPr>
-        <w:t xml:space="preserve"> </w:t>
-      </w:r>
-      <w:r>
-        <w:rPr>
-          <w:rFonts w:asciiTheme="majorBidi" w:hAnsiTheme="majorBidi" w:cstheme="majorBidi"/>
-          <w:sz w:val="24"/>
-          <w:szCs w:val="24"/>
-          <w:rtl/>
-          <w:lang w:bidi="ar-IQ"/>
-        </w:rPr>
-        <w:t>%}</w:t>
       </w:r>
     </w:p>
     <w:p>
@@ -3579,20 +3686,19 @@
           <w:numId w:val="29"/>
         </w:numPr>
         <w:rPr>
-          <w:rFonts w:asciiTheme="majorBidi" w:hAnsiTheme="majorBidi" w:cstheme="majorBidi"/>
-          <w:sz w:val="24"/>
-          <w:szCs w:val="24"/>
-          <w:lang w:bidi="ar-IQ"/>
-        </w:rPr>
-      </w:pPr>
-      <w:r>
-        <w:rPr>
-          <w:rFonts w:asciiTheme="majorBidi" w:hAnsiTheme="majorBidi" w:cstheme="majorBidi"/>
-          <w:sz w:val="24"/>
-          <w:szCs w:val="24"/>
-          <w:rtl/>
-        </w:rPr>
-        <w:t xml:space="preserve">عدد الدروس التي اجتازها في المحاولة الثانية: </w:t>
+          <w:rFonts w:asciiTheme="majorBidi" w:hAnsiTheme="majorBidi" w:cstheme="majorBidi" w:hint="cs"/>
+          <w:lang w:bidi="ar-IQ"/>
+        </w:rPr>
+      </w:pPr>
+      <w:r>
+        <w:rPr>
+          <w:rFonts w:asciiTheme="majorBidi" w:hAnsiTheme="majorBidi" w:cstheme="majorBidi" w:hint="cs"/>
+          <w:sz w:val="24"/>
+          <w:szCs w:val="24"/>
+          <w:rtl/>
+          <w:lang w:bidi="ar-IQ"/>
+        </w:rPr>
+        <w:t xml:space="preserve">السنة </w:t>
       </w:r>
       <w:r>
         <w:rPr>
@@ -3604,17 +3710,36 @@
         </w:rPr>
         <w:t>{{</w:t>
       </w:r>
-      <w:proofErr w:type="spellStart"/>
-      <w:r>
-        <w:rPr>
-          <w:rFonts w:asciiTheme="majorBidi" w:hAnsiTheme="majorBidi" w:cstheme="majorBidi"/>
-          <w:sz w:val="24"/>
-          <w:szCs w:val="24"/>
-          <w:lang w:bidi="ar-IQ"/>
-        </w:rPr>
-        <w:t>Subjects_Passed_with_Second_Trial</w:t>
-      </w:r>
-      <w:proofErr w:type="spellEnd"/>
+      <w:r>
+        <w:rPr>
+          <w:rFonts w:asciiTheme="majorBidi" w:hAnsiTheme="majorBidi" w:cstheme="majorBidi"/>
+          <w:lang w:bidi="ar-IQ"/>
+        </w:rPr>
+        <w:t xml:space="preserve"> </w:t>
+      </w:r>
+      <w:r>
+        <w:rPr>
+          <w:rFonts w:asciiTheme="majorBidi" w:hAnsiTheme="majorBidi" w:cstheme="majorBidi"/>
+          <w:lang w:bidi="ar-IQ"/>
+        </w:rPr>
+        <w:t>year</w:t>
+      </w:r>
+      <w:r>
+        <w:rPr>
+          <w:rFonts w:asciiTheme="majorBidi" w:hAnsiTheme="majorBidi" w:cstheme="majorBidi"/>
+          <w:lang w:bidi="ar-IQ"/>
+        </w:rPr>
+        <w:t>.</w:t>
+      </w:r>
+      <w:r>
+        <w:rPr>
+          <w:rFonts w:asciiTheme="majorBidi" w:hAnsiTheme="majorBidi" w:cstheme="majorBidi"/>
+          <w:sz w:val="24"/>
+          <w:szCs w:val="24"/>
+          <w:lang w:bidi="ar-IQ"/>
+        </w:rPr>
+        <w:t>year_d</w:t>
+      </w:r>
       <w:r>
         <w:rPr>
           <w:rFonts w:asciiTheme="majorBidi" w:hAnsiTheme="majorBidi" w:cstheme="majorBidi"/>
@@ -3630,18 +3755,129 @@
           <w:rFonts w:asciiTheme="majorBidi" w:hAnsiTheme="majorBidi" w:cstheme="majorBidi"/>
           <w:sz w:val="24"/>
           <w:szCs w:val="24"/>
-          <w:rtl/>
-        </w:rPr>
-        <w:t>.</w:t>
+          <w:lang w:bidi="ar-IQ"/>
+        </w:rPr>
+        <w:t xml:space="preserve"> </w:t>
+      </w:r>
+      <w:r>
+        <w:rPr>
+          <w:rFonts w:asciiTheme="majorBidi" w:hAnsiTheme="majorBidi" w:cstheme="majorBidi" w:hint="cs"/>
+          <w:sz w:val="24"/>
+          <w:szCs w:val="24"/>
+          <w:rtl/>
+          <w:lang w:bidi="ar-IQ"/>
+        </w:rPr>
+        <w:t>/ المرحلة {{</w:t>
+      </w:r>
+      <w:r>
+        <w:rPr>
+          <w:rFonts w:asciiTheme="majorBidi" w:hAnsiTheme="majorBidi" w:cstheme="majorBidi"/>
+          <w:lang w:bidi="ar-IQ"/>
+        </w:rPr>
+        <w:t xml:space="preserve"> </w:t>
+      </w:r>
+      <w:r>
+        <w:rPr>
+          <w:rFonts w:asciiTheme="majorBidi" w:hAnsiTheme="majorBidi" w:cstheme="majorBidi"/>
+          <w:lang w:bidi="ar-IQ"/>
+        </w:rPr>
+        <w:t>year.</w:t>
+      </w:r>
+      <w:r>
+        <w:rPr>
+          <w:rFonts w:asciiTheme="majorBidi" w:hAnsiTheme="majorBidi" w:cstheme="majorBidi"/>
+          <w:sz w:val="24"/>
+          <w:szCs w:val="24"/>
+          <w:lang w:bidi="ar-IQ"/>
+        </w:rPr>
+        <w:t>stage</w:t>
+      </w:r>
+      <w:r>
+        <w:rPr>
+          <w:rFonts w:asciiTheme="majorBidi" w:hAnsiTheme="majorBidi" w:cstheme="majorBidi" w:hint="cs"/>
+          <w:sz w:val="24"/>
+          <w:szCs w:val="24"/>
+          <w:rtl/>
+          <w:lang w:bidi="ar-IQ"/>
+        </w:rPr>
+        <w:t>}} (سنة {{</w:t>
+      </w:r>
+      <w:r>
+        <w:rPr>
+          <w:rFonts w:asciiTheme="majorBidi" w:hAnsiTheme="majorBidi" w:cstheme="majorBidi"/>
+          <w:lang w:bidi="ar-IQ"/>
+        </w:rPr>
+        <w:t xml:space="preserve"> </w:t>
+      </w:r>
+      <w:r>
+        <w:rPr>
+          <w:rFonts w:asciiTheme="majorBidi" w:hAnsiTheme="majorBidi" w:cstheme="majorBidi"/>
+          <w:lang w:bidi="ar-IQ"/>
+        </w:rPr>
+        <w:t>year.</w:t>
+      </w:r>
+      <w:r>
+        <w:rPr>
+          <w:rFonts w:asciiTheme="majorBidi" w:hAnsiTheme="majorBidi" w:cstheme="majorBidi"/>
+          <w:sz w:val="24"/>
+          <w:szCs w:val="24"/>
+          <w:lang w:bidi="ar-IQ"/>
+        </w:rPr>
+        <w:t>state</w:t>
+      </w:r>
+      <w:r>
+        <w:rPr>
+          <w:rFonts w:asciiTheme="majorBidi" w:hAnsiTheme="majorBidi" w:cstheme="majorBidi" w:hint="cs"/>
+          <w:sz w:val="24"/>
+          <w:szCs w:val="24"/>
+          <w:rtl/>
+          <w:lang w:bidi="ar-IQ"/>
+        </w:rPr>
+        <w:t>}})</w:t>
       </w:r>
     </w:p>
     <w:p>
       <w:pPr>
-        <w:rPr>
-          <w:rFonts w:asciiTheme="majorBidi" w:hAnsiTheme="majorBidi" w:cstheme="majorBidi"/>
-          <w:sz w:val="24"/>
-          <w:szCs w:val="24"/>
-          <w:rtl/>
+        <w:keepNext/>
+        <w:keepLines/>
+        <w:spacing w:line="240" w:lineRule="auto"/>
+        <w:rPr>
+          <w:rFonts w:asciiTheme="majorBidi" w:hAnsiTheme="majorBidi" w:cstheme="majorBidi"/>
+          <w:lang w:bidi="ar-IQ"/>
+        </w:rPr>
+      </w:pPr>
+      <w:r>
+        <w:rPr>
+          <w:rFonts w:asciiTheme="majorBidi" w:hAnsiTheme="majorBidi" w:cstheme="majorBidi"/>
+          <w:rtl/>
+          <w:lang w:bidi="ar-IQ"/>
+        </w:rPr>
+        <w:t xml:space="preserve">{% </w:t>
+      </w:r>
+      <w:r>
+        <w:rPr>
+          <w:rFonts w:asciiTheme="majorBidi" w:hAnsiTheme="majorBidi" w:cstheme="majorBidi"/>
+          <w:lang w:bidi="ar-IQ"/>
+        </w:rPr>
+        <w:t>endfor</w:t>
+      </w:r>
+      <w:r>
+        <w:rPr>
+          <w:rFonts w:asciiTheme="majorBidi" w:hAnsiTheme="majorBidi" w:cstheme="majorBidi"/>
+          <w:rtl/>
+          <w:lang w:bidi="ar-IQ"/>
+        </w:rPr>
+        <w:t xml:space="preserve"> %}</w:t>
+      </w:r>
+    </w:p>
+    <w:p>
+      <w:pPr>
+        <w:rPr>
+          <w:rFonts w:asciiTheme="majorBidi" w:hAnsiTheme="majorBidi" w:cstheme="majorBidi"/>
+          <w:sz w:val="24"/>
+          <w:szCs w:val="24"/>
+          <w:rtl/>
+          <w:lang w:bidi="ar-IQ"/>
         </w:rPr>
       </w:pPr>
       <w:r>
@@ -3661,45 +3897,57 @@
           <w:szCs w:val="24"/>
           <w:lang w:bidi="ar-IQ"/>
         </w:rPr>
-        <w:t xml:space="preserve">p </w:t>
-      </w:r>
-      <w:r>
-        <w:rPr>
-          <w:rFonts w:asciiTheme="majorBidi" w:hAnsiTheme="majorBidi" w:cstheme="majorBidi"/>
-          <w:sz w:val="24"/>
-          <w:szCs w:val="24"/>
-          <w:lang w:bidi="ar-IQ"/>
-        </w:rPr>
-        <w:t>endif</w:t>
-      </w:r>
-      <w:r>
-        <w:rPr>
-          <w:rFonts w:asciiTheme="majorBidi" w:hAnsiTheme="majorBidi" w:cstheme="majorBidi"/>
-          <w:sz w:val="24"/>
-          <w:szCs w:val="24"/>
-          <w:rtl/>
-          <w:lang w:bidi="ar-IQ"/>
-        </w:rPr>
-        <w:t xml:space="preserve"> </w:t>
-      </w:r>
-      <w:r>
-        <w:rPr>
-          <w:rFonts w:asciiTheme="majorBidi" w:hAnsiTheme="majorBidi" w:cstheme="majorBidi"/>
-          <w:sz w:val="24"/>
-          <w:szCs w:val="24"/>
-          <w:rtl/>
-          <w:lang w:bidi="ar-IQ"/>
-        </w:rPr>
-        <w:t>%}</w:t>
-      </w:r>
-      <w:r>
-        <w:rPr>
-          <w:rFonts w:asciiTheme="majorBidi" w:hAnsiTheme="majorBidi" w:cstheme="majorBidi"/>
-          <w:sz w:val="24"/>
-          <w:szCs w:val="24"/>
-          <w:rtl/>
-        </w:rPr>
-        <w:t xml:space="preserve"> </w:t>
+        <w:t>p endif</w:t>
+      </w:r>
+      <w:r>
+        <w:rPr>
+          <w:rFonts w:asciiTheme="majorBidi" w:hAnsiTheme="majorBidi" w:cstheme="majorBidi"/>
+          <w:sz w:val="24"/>
+          <w:szCs w:val="24"/>
+          <w:rtl/>
+          <w:lang w:bidi="ar-IQ"/>
+        </w:rPr>
+        <w:t xml:space="preserve"> %}</w:t>
+      </w:r>
+    </w:p>
+    <w:p>
+      <w:pPr>
+        <w:rPr>
+          <w:rFonts w:asciiTheme="majorBidi" w:hAnsiTheme="majorBidi" w:cstheme="majorBidi"/>
+          <w:sz w:val="24"/>
+          <w:szCs w:val="24"/>
+          <w:rtl/>
+          <w:lang w:bidi="ar-IQ"/>
+        </w:rPr>
+      </w:pPr>
+      <w:r>
+        <w:rPr>
+          <w:rFonts w:asciiTheme="majorBidi" w:hAnsiTheme="majorBidi" w:cstheme="majorBidi"/>
+          <w:sz w:val="24"/>
+          <w:szCs w:val="24"/>
+          <w:rtl/>
+          <w:lang w:bidi="ar-IQ"/>
+        </w:rPr>
+        <w:t>{%</w:t>
+      </w:r>
+      <w:r>
+        <w:rPr>
+          <w:rFonts w:asciiTheme="majorBidi" w:hAnsiTheme="majorBidi" w:cstheme="majorBidi"/>
+          <w:sz w:val="24"/>
+          <w:szCs w:val="24"/>
+          <w:lang w:bidi="ar-IQ"/>
+        </w:rPr>
+        <w:t>p if Passed_ON</w:t>
+      </w:r>
+      <w:r>
+        <w:rPr>
+          <w:rFonts w:asciiTheme="majorBidi" w:hAnsiTheme="majorBidi" w:cstheme="majorBidi"/>
+          <w:sz w:val="24"/>
+          <w:szCs w:val="24"/>
+          <w:rtl/>
+          <w:lang w:bidi="ar-IQ"/>
+        </w:rPr>
+        <w:t xml:space="preserve"> %}</w:t>
       </w:r>
     </w:p>
     <w:p>
@@ -3713,19 +3961,328 @@
           <w:rFonts w:asciiTheme="majorBidi" w:hAnsiTheme="majorBidi" w:cstheme="majorBidi"/>
           <w:sz w:val="24"/>
           <w:szCs w:val="24"/>
-          <w:rtl/>
-          <w:lang w:bidi="ar-IQ"/>
-        </w:rPr>
-      </w:pPr>
-      <w:r>
-        <w:rPr>
-          <w:rFonts w:asciiTheme="majorBidi" w:hAnsiTheme="majorBidi" w:cstheme="majorBidi"/>
-          <w:sz w:val="24"/>
-          <w:szCs w:val="24"/>
-          <w:rtl/>
-          <w:lang w:bidi="ar-IQ"/>
-        </w:rPr>
-        <w:t>لغة التدريس طوال فترة الدراسة هي اللغة الإنجليزية.</w:t>
+          <w:lang w:bidi="ar-IQ"/>
+        </w:rPr>
+      </w:pPr>
+      <w:r>
+        <w:rPr>
+          <w:rFonts w:asciiTheme="majorBidi" w:hAnsiTheme="majorBidi" w:cstheme="majorBidi" w:hint="cs"/>
+          <w:sz w:val="24"/>
+          <w:szCs w:val="24"/>
+          <w:rtl/>
+        </w:rPr>
+        <w:t>دور ثاني للمادة الدراسية المعنية:</w:t>
+      </w:r>
+    </w:p>
+    <w:p>
+      <w:pPr>
+        <w:rPr>
+          <w:rFonts w:asciiTheme="majorBidi" w:hAnsiTheme="majorBidi" w:cstheme="majorBidi"/>
+          <w:lang w:bidi="ar-IQ"/>
+        </w:rPr>
+      </w:pPr>
+      <w:r>
+        <w:rPr>
+          <w:rFonts w:asciiTheme="majorBidi" w:hAnsiTheme="majorBidi" w:cstheme="majorBidi"/>
+          <w:rtl/>
+          <w:lang w:bidi="ar-IQ"/>
+        </w:rPr>
+        <w:t xml:space="preserve">{% </w:t>
+      </w:r>
+      <w:r>
+        <w:rPr>
+          <w:rFonts w:asciiTheme="majorBidi" w:hAnsiTheme="majorBidi" w:cstheme="majorBidi"/>
+          <w:lang w:bidi="ar-IQ"/>
+        </w:rPr>
+        <w:t xml:space="preserve">for </w:t>
+      </w:r>
+      <w:r>
+        <w:rPr>
+          <w:rFonts w:asciiTheme="majorBidi" w:hAnsiTheme="majorBidi" w:cstheme="majorBidi"/>
+          <w:lang w:bidi="ar-IQ"/>
+        </w:rPr>
+        <w:t>t_</w:t>
+      </w:r>
+      <w:r>
+        <w:rPr>
+          <w:rFonts w:asciiTheme="majorBidi" w:hAnsiTheme="majorBidi" w:cstheme="majorBidi"/>
+          <w:lang w:bidi="ar-IQ"/>
+        </w:rPr>
+        <w:t>year in</w:t>
+      </w:r>
+      <w:r>
+        <w:rPr>
+          <w:rFonts w:asciiTheme="majorBidi" w:hAnsiTheme="majorBidi" w:cstheme="majorBidi"/>
+          <w:lang w:bidi="ar-IQ"/>
+        </w:rPr>
+        <w:t xml:space="preserve"> attempts</w:t>
+      </w:r>
+      <w:r>
+        <w:rPr>
+          <w:rFonts w:asciiTheme="majorBidi" w:hAnsiTheme="majorBidi" w:cstheme="majorBidi"/>
+          <w:rtl/>
+          <w:lang w:bidi="ar-IQ"/>
+        </w:rPr>
+        <w:t xml:space="preserve"> %}</w:t>
+      </w:r>
+    </w:p>
+    <w:p>
+      <w:pPr>
+        <w:pStyle w:val="ListParagraph"/>
+        <w:numPr>
+          <w:ilvl w:val="1"/>
+          <w:numId w:val="29"/>
+        </w:numPr>
+        <w:rPr>
+          <w:rFonts w:asciiTheme="majorBidi" w:hAnsiTheme="majorBidi" w:cstheme="majorBidi"/>
+          <w:sz w:val="24"/>
+          <w:szCs w:val="24"/>
+          <w:lang w:bidi="ar-IQ"/>
+        </w:rPr>
+      </w:pPr>
+      <w:r>
+        <w:rPr>
+          <w:rFonts w:asciiTheme="majorBidi" w:hAnsiTheme="majorBidi" w:cstheme="majorBidi" w:hint="cs"/>
+          <w:sz w:val="24"/>
+          <w:szCs w:val="24"/>
+          <w:rtl/>
+        </w:rPr>
+        <w:t>العام الدراسي</w:t>
+      </w:r>
+      <w:r>
+        <w:rPr>
+          <w:rFonts w:asciiTheme="majorBidi" w:hAnsiTheme="majorBidi" w:cstheme="majorBidi"/>
+          <w:sz w:val="24"/>
+          <w:szCs w:val="24"/>
+          <w:rtl/>
+        </w:rPr>
+        <w:t>:</w:t>
+      </w:r>
+      <w:r>
+        <w:rPr>
+          <w:rFonts w:asciiTheme="majorBidi" w:hAnsiTheme="majorBidi" w:cstheme="majorBidi" w:hint="cs"/>
+          <w:sz w:val="24"/>
+          <w:szCs w:val="24"/>
+          <w:rtl/>
+        </w:rPr>
+        <w:t xml:space="preserve"> </w:t>
+      </w:r>
+      <w:r>
+        <w:rPr>
+          <w:rFonts w:asciiTheme="majorBidi" w:hAnsiTheme="majorBidi" w:cstheme="majorBidi"/>
+          <w:sz w:val="24"/>
+          <w:szCs w:val="24"/>
+        </w:rPr>
+        <w:t>{{t_</w:t>
+      </w:r>
+      <w:r>
+        <w:rPr>
+          <w:rFonts w:asciiTheme="majorBidi" w:hAnsiTheme="majorBidi" w:cstheme="majorBidi"/>
+          <w:lang w:bidi="ar-IQ"/>
+        </w:rPr>
+        <w:t xml:space="preserve"> year</w:t>
+      </w:r>
+      <w:r>
+        <w:rPr>
+          <w:rFonts w:asciiTheme="majorBidi" w:hAnsiTheme="majorBidi" w:cstheme="majorBidi"/>
+          <w:sz w:val="24"/>
+          <w:szCs w:val="24"/>
+        </w:rPr>
+        <w:t>.year}}</w:t>
+      </w:r>
+      <w:r>
+        <w:rPr>
+          <w:rFonts w:asciiTheme="majorBidi" w:hAnsiTheme="majorBidi" w:cstheme="majorBidi"/>
+          <w:sz w:val="24"/>
+          <w:szCs w:val="24"/>
+          <w:rtl/>
+        </w:rPr>
+        <w:t xml:space="preserve"> </w:t>
+      </w:r>
+      <w:r>
+        <w:rPr>
+          <w:rFonts w:asciiTheme="majorBidi" w:hAnsiTheme="majorBidi" w:cstheme="majorBidi"/>
+          <w:sz w:val="24"/>
+          <w:szCs w:val="24"/>
+        </w:rPr>
+        <w:t xml:space="preserve"> </w:t>
+      </w:r>
+      <w:r>
+        <w:rPr>
+          <w:rFonts w:asciiTheme="majorBidi" w:hAnsiTheme="majorBidi" w:cstheme="majorBidi" w:hint="cs"/>
+          <w:sz w:val="24"/>
+          <w:szCs w:val="24"/>
+          <w:rtl/>
+        </w:rPr>
+        <w:t xml:space="preserve">/  المرحلة </w:t>
+      </w:r>
+      <w:r>
+        <w:rPr>
+          <w:rFonts w:asciiTheme="majorBidi" w:hAnsiTheme="majorBidi" w:cstheme="majorBidi"/>
+          <w:sz w:val="24"/>
+          <w:szCs w:val="24"/>
+        </w:rPr>
+        <w:t>{{t_</w:t>
+      </w:r>
+      <w:r>
+        <w:rPr>
+          <w:rFonts w:asciiTheme="majorBidi" w:hAnsiTheme="majorBidi" w:cstheme="majorBidi"/>
+          <w:lang w:bidi="ar-IQ"/>
+        </w:rPr>
+        <w:t xml:space="preserve"> year</w:t>
+      </w:r>
+      <w:r>
+        <w:rPr>
+          <w:rFonts w:asciiTheme="majorBidi" w:hAnsiTheme="majorBidi" w:cstheme="majorBidi"/>
+          <w:sz w:val="24"/>
+          <w:szCs w:val="24"/>
+        </w:rPr>
+        <w:t>.stage}}</w:t>
+      </w:r>
+      <w:r>
+        <w:rPr>
+          <w:rFonts w:asciiTheme="majorBidi" w:hAnsiTheme="majorBidi" w:cstheme="majorBidi"/>
+          <w:sz w:val="24"/>
+          <w:szCs w:val="24"/>
+        </w:rPr>
+        <w:t xml:space="preserve"> </w:t>
+      </w:r>
+      <w:r>
+        <w:rPr>
+          <w:rFonts w:asciiTheme="majorBidi" w:hAnsiTheme="majorBidi" w:cstheme="majorBidi" w:hint="cs"/>
+          <w:sz w:val="24"/>
+          <w:szCs w:val="24"/>
+          <w:rtl/>
+        </w:rPr>
+        <w:t xml:space="preserve"> </w:t>
+      </w:r>
+      <w:r>
+        <w:rPr>
+          <w:rFonts w:asciiTheme="majorBidi" w:hAnsiTheme="majorBidi" w:cstheme="majorBidi" w:hint="cs"/>
+          <w:sz w:val="24"/>
+          <w:szCs w:val="24"/>
+          <w:rtl/>
+        </w:rPr>
+        <w:t xml:space="preserve"> ( </w:t>
+      </w:r>
+      <w:r>
+        <w:rPr>
+          <w:rFonts w:asciiTheme="majorBidi" w:hAnsiTheme="majorBidi" w:cstheme="majorBidi"/>
+          <w:sz w:val="24"/>
+          <w:szCs w:val="24"/>
+        </w:rPr>
+        <w:t>{{t_</w:t>
+      </w:r>
+      <w:r>
+        <w:rPr>
+          <w:rFonts w:asciiTheme="majorBidi" w:hAnsiTheme="majorBidi" w:cstheme="majorBidi"/>
+          <w:lang w:bidi="ar-IQ"/>
+        </w:rPr>
+        <w:t xml:space="preserve"> year</w:t>
+      </w:r>
+      <w:r>
+        <w:rPr>
+          <w:rFonts w:asciiTheme="majorBidi" w:hAnsiTheme="majorBidi" w:cstheme="majorBidi"/>
+          <w:sz w:val="24"/>
+          <w:szCs w:val="24"/>
+        </w:rPr>
+        <w:t xml:space="preserve">.subjects}} </w:t>
+      </w:r>
+      <w:r>
+        <w:rPr>
+          <w:rFonts w:asciiTheme="majorBidi" w:hAnsiTheme="majorBidi" w:cstheme="majorBidi" w:hint="cs"/>
+          <w:sz w:val="24"/>
+          <w:szCs w:val="24"/>
+          <w:rtl/>
+        </w:rPr>
+        <w:t xml:space="preserve"> ).</w:t>
+      </w:r>
+    </w:p>
+    <w:p>
+      <w:pPr>
+        <w:rPr>
+          <w:rFonts w:asciiTheme="majorBidi" w:hAnsiTheme="majorBidi" w:cstheme="majorBidi"/>
+          <w:sz w:val="24"/>
+          <w:szCs w:val="24"/>
+          <w:lang w:bidi="ar-IQ"/>
+        </w:rPr>
+      </w:pPr>
+      <w:r>
+        <w:rPr>
+          <w:rFonts w:asciiTheme="majorBidi" w:hAnsiTheme="majorBidi" w:cstheme="majorBidi"/>
+          <w:sz w:val="20"/>
+          <w:szCs w:val="20"/>
+          <w:rtl/>
+          <w:lang w:bidi="ar-IQ"/>
+        </w:rPr>
+        <w:t>{%</w:t>
+      </w:r>
+      <w:r>
+        <w:rPr>
+          <w:rFonts w:asciiTheme="majorBidi" w:hAnsiTheme="majorBidi" w:cstheme="majorBidi"/>
+          <w:sz w:val="20"/>
+          <w:szCs w:val="20"/>
+          <w:lang w:bidi="ar-IQ"/>
+        </w:rPr>
+        <w:t>tr for row in pair.rows</w:t>
+      </w:r>
+      <w:r>
+        <w:rPr>
+          <w:rFonts w:asciiTheme="majorBidi" w:hAnsiTheme="majorBidi" w:cstheme="majorBidi"/>
+          <w:sz w:val="20"/>
+          <w:szCs w:val="20"/>
+          <w:rtl/>
+          <w:lang w:bidi="ar-IQ"/>
+        </w:rPr>
+        <w:t xml:space="preserve"> %}</w:t>
+      </w:r>
+    </w:p>
+    <w:p>
+      <w:pPr>
+        <w:rPr>
+          <w:rFonts w:asciiTheme="majorBidi" w:hAnsiTheme="majorBidi" w:cstheme="majorBidi"/>
+          <w:sz w:val="24"/>
+          <w:szCs w:val="24"/>
+          <w:rtl/>
+        </w:rPr>
+      </w:pPr>
+      <w:r>
+        <w:rPr>
+          <w:rFonts w:asciiTheme="majorBidi" w:hAnsiTheme="majorBidi" w:cstheme="majorBidi"/>
+          <w:sz w:val="24"/>
+          <w:szCs w:val="24"/>
+          <w:rtl/>
+          <w:lang w:bidi="ar-IQ"/>
+        </w:rPr>
+        <w:t>{%</w:t>
+      </w:r>
+      <w:r>
+        <w:rPr>
+          <w:rFonts w:asciiTheme="majorBidi" w:hAnsiTheme="majorBidi" w:cstheme="majorBidi"/>
+          <w:sz w:val="24"/>
+          <w:szCs w:val="24"/>
+          <w:lang w:bidi="ar-IQ"/>
+        </w:rPr>
+        <w:t>p endif</w:t>
+      </w:r>
+      <w:r>
+        <w:rPr>
+          <w:rFonts w:asciiTheme="majorBidi" w:hAnsiTheme="majorBidi" w:cstheme="majorBidi"/>
+          <w:sz w:val="24"/>
+          <w:szCs w:val="24"/>
+          <w:rtl/>
+          <w:lang w:bidi="ar-IQ"/>
+        </w:rPr>
+        <w:t xml:space="preserve"> %}</w:t>
+      </w:r>
+      <w:r>
+        <w:rPr>
+          <w:rFonts w:asciiTheme="majorBidi" w:hAnsiTheme="majorBidi" w:cstheme="majorBidi"/>
+          <w:sz w:val="24"/>
+          <w:szCs w:val="24"/>
+          <w:rtl/>
+        </w:rPr>
+        <w:t xml:space="preserve"> </w:t>
       </w:r>
     </w:p>
     <w:p>
@@ -3739,6 +4296,73 @@
           <w:rFonts w:asciiTheme="majorBidi" w:hAnsiTheme="majorBidi" w:cstheme="majorBidi"/>
           <w:sz w:val="24"/>
           <w:szCs w:val="24"/>
+          <w:rtl/>
+          <w:lang w:bidi="ar-IQ"/>
+        </w:rPr>
+      </w:pPr>
+      <w:r>
+        <w:rPr>
+          <w:rFonts w:asciiTheme="majorBidi" w:hAnsiTheme="majorBidi" w:cstheme="majorBidi"/>
+          <w:sz w:val="24"/>
+          <w:szCs w:val="24"/>
+          <w:rtl/>
+          <w:lang w:bidi="ar-IQ"/>
+        </w:rPr>
+        <w:lastRenderedPageBreak/>
+        <w:t xml:space="preserve">الدراسة </w:t>
+      </w:r>
+      <w:r>
+        <w:rPr>
+          <w:rFonts w:asciiTheme="majorBidi" w:hAnsiTheme="majorBidi" w:cstheme="majorBidi" w:hint="cs"/>
+          <w:sz w:val="24"/>
+          <w:szCs w:val="24"/>
+          <w:rtl/>
+          <w:lang w:bidi="ar-IQ"/>
+        </w:rPr>
+        <w:t>ب</w:t>
+      </w:r>
+      <w:r>
+        <w:rPr>
+          <w:rFonts w:asciiTheme="majorBidi" w:hAnsiTheme="majorBidi" w:cstheme="majorBidi"/>
+          <w:sz w:val="24"/>
+          <w:szCs w:val="24"/>
+          <w:rtl/>
+          <w:lang w:bidi="ar-IQ"/>
+        </w:rPr>
+        <w:t>اللغة الإن</w:t>
+      </w:r>
+      <w:r>
+        <w:rPr>
+          <w:rFonts w:asciiTheme="majorBidi" w:hAnsiTheme="majorBidi" w:cstheme="majorBidi" w:hint="cs"/>
+          <w:sz w:val="24"/>
+          <w:szCs w:val="24"/>
+          <w:rtl/>
+          <w:lang w:bidi="ar-IQ"/>
+        </w:rPr>
+        <w:t>ك</w:t>
+      </w:r>
+      <w:r>
+        <w:rPr>
+          <w:rFonts w:asciiTheme="majorBidi" w:hAnsiTheme="majorBidi" w:cstheme="majorBidi"/>
+          <w:sz w:val="24"/>
+          <w:szCs w:val="24"/>
+          <w:rtl/>
+          <w:lang w:bidi="ar-IQ"/>
+        </w:rPr>
+        <w:t>ليزية.</w:t>
+      </w:r>
+    </w:p>
+    <w:p>
+      <w:pPr>
+        <w:pStyle w:val="ListParagraph"/>
+        <w:numPr>
+          <w:ilvl w:val="0"/>
+          <w:numId w:val="29"/>
+        </w:numPr>
+        <w:rPr>
+          <w:rFonts w:asciiTheme="majorBidi" w:hAnsiTheme="majorBidi" w:cstheme="majorBidi"/>
+          <w:sz w:val="24"/>
+          <w:szCs w:val="24"/>
           <w:lang w:bidi="ar-IQ"/>
         </w:rPr>
       </w:pPr>
@@ -3767,7 +4391,7 @@
           <w:szCs w:val="24"/>
           <w:rtl/>
         </w:rPr>
-        <w:t xml:space="preserve"> خالية من الخدش والت</w:t>
+        <w:t xml:space="preserve"> خالية من ال</w:t>
       </w:r>
       <w:r>
         <w:rPr>
@@ -3776,7 +4400,25 @@
           <w:szCs w:val="24"/>
           <w:rtl/>
         </w:rPr>
-        <w:t>عديل</w:t>
+        <w:t>حك</w:t>
+      </w:r>
+      <w:r>
+        <w:rPr>
+          <w:rFonts w:asciiTheme="majorBidi" w:hAnsiTheme="majorBidi" w:cstheme="majorBidi"/>
+          <w:sz w:val="24"/>
+          <w:szCs w:val="24"/>
+          <w:rtl/>
+        </w:rPr>
+        <w:t xml:space="preserve"> وال</w:t>
+      </w:r>
+      <w:r>
+        <w:rPr>
+          <w:rFonts w:asciiTheme="majorBidi" w:hAnsiTheme="majorBidi" w:cstheme="majorBidi" w:hint="cs"/>
+          <w:sz w:val="24"/>
+          <w:szCs w:val="24"/>
+          <w:rtl/>
+        </w:rPr>
+        <w:t>شطب</w:t>
       </w:r>
       <w:r>
         <w:rPr>
@@ -3787,6 +4429,16 @@
         </w:rPr>
         <w:t>.</w:t>
       </w:r>
+    </w:p>
+    <w:p>
+      <w:pPr>
+        <w:rPr>
+          <w:rFonts w:asciiTheme="majorBidi" w:hAnsiTheme="majorBidi" w:cstheme="majorBidi"/>
+          <w:sz w:val="24"/>
+          <w:szCs w:val="24"/>
+          <w:lang w:bidi="ar-IQ"/>
+        </w:rPr>
+      </w:pPr>
     </w:p>
     <w:sectPr>
       <w:footerReference w:type="default" r:id="rId12"/>
@@ -3943,7 +4595,7 @@
         <w:noProof/>
         <w:lang w:bidi="ar-IQ"/>
       </w:rPr>
-      <w:instrText>2</w:instrText>
+      <w:instrText>4</w:instrText>
     </w:r>
     <w:r>
       <w:rPr>
@@ -3972,7 +4624,7 @@
         <w:rtl/>
         <w:lang w:bidi="ar-IQ"/>
       </w:rPr>
-      <w:t>-1</w:t>
+      <w:t>-3</w:t>
     </w:r>
     <w:r>
       <w:rPr>
@@ -4607,7 +5259,7 @@
   <w:abstractNum w:abstractNumId="3" w15:restartNumberingAfterBreak="0">
     <w:nsid w:val="0704594E"/>
     <w:multiLevelType w:val="hybridMultilevel"/>
-    <w:tmpl w:val="3734357C"/>
+    <w:tmpl w:val="8B62BF86"/>
     <w:lvl w:ilvl="0" w:tplc="04090001">
       <w:start w:val="1"/>
       <w:numFmt w:val="bullet"/>
@@ -4620,7 +5272,7 @@
         <w:rFonts w:ascii="Symbol" w:hAnsi="Symbol" w:hint="default"/>
       </w:rPr>
     </w:lvl>
-    <w:lvl w:ilvl="1" w:tplc="04090003" w:tentative="1">
+    <w:lvl w:ilvl="1" w:tplc="04090003">
       <w:start w:val="1"/>
       <w:numFmt w:val="bullet"/>
       <w:lvlText w:val="o"/>
@@ -7591,7 +8243,7 @@
   <w:style w:type="paragraph" w:default="1" w:styleId="Normal">
     <w:name w:val="Normal"/>
     <w:qFormat/>
-    <w:rsid w:val="00B25239"/>
+    <w:rsid w:val="003F1A04"/>
     <w:pPr>
       <w:bidi/>
       <w:spacing w:after="200" w:line="276" w:lineRule="auto"/>

</xml_diff>